<commit_message>
fix(docs): inject jinja2 placeholders into docx templates and add robust context logic
</commit_message>
<xml_diff>
--- a/Code/backend/templates/bao_cao_template.docx
+++ b/Code/backend/templates/bao_cao_template.docx
@@ -79,43 +79,38 @@
                 <w:sz w:val="24"/>
                 <w:szCs w:val="24"/>
               </w:rPr>
-              <w:t>Số</w:t>
-            </w:r>
-            <w:proofErr w:type="spellEnd"/>
-            <w:r>
-              <w:rPr>
-                <w:sz w:val="24"/>
-                <w:szCs w:val="24"/>
-              </w:rPr>
-              <w:t>:</w:t>
-            </w:r>
-            <w:r>
-              <w:rPr>
-                <w:sz w:val="24"/>
-                <w:szCs w:val="24"/>
-              </w:rPr>
-              <w:t>….</w:t>
-            </w:r>
-            <w:r>
-              <w:rPr>
-                <w:sz w:val="24"/>
-                <w:szCs w:val="24"/>
-              </w:rPr>
-              <w:t>0/MBF.</w:t>
-            </w:r>
-            <w:r>
-              <w:rPr>
-                <w:sz w:val="24"/>
-                <w:szCs w:val="24"/>
-              </w:rPr>
-              <w:t>NBH</w:t>
-            </w:r>
-            <w:r>
-              <w:rPr>
-                <w:sz w:val="24"/>
-                <w:szCs w:val="24"/>
-              </w:rPr>
-              <w:t>-KDT</w:t>
+              <w:t>Số: {{BC_so_bao_cao}}</w:t>
+            </w:r>
+            <w:proofErr w:type="spellEnd"/>
+            <w:r>
+              <w:rPr>
+                <w:sz w:val="24"/>
+                <w:szCs w:val="24"/>
+              </w:rPr>
+            </w:r>
+            <w:r>
+              <w:rPr>
+                <w:sz w:val="24"/>
+                <w:szCs w:val="24"/>
+              </w:rPr>
+            </w:r>
+            <w:r>
+              <w:rPr>
+                <w:sz w:val="24"/>
+                <w:szCs w:val="24"/>
+              </w:rPr>
+            </w:r>
+            <w:r>
+              <w:rPr>
+                <w:sz w:val="24"/>
+                <w:szCs w:val="24"/>
+              </w:rPr>
+            </w:r>
+            <w:r>
+              <w:rPr>
+                <w:sz w:val="24"/>
+                <w:szCs w:val="24"/>
+              </w:rPr>
             </w:r>
           </w:p>
         </w:tc>
@@ -261,7 +256,7 @@
                 <w:sz w:val="24"/>
                 <w:szCs w:val="24"/>
               </w:rPr>
-              <w:t>Hà</w:t>
+              <w:t>Hà Nội, ngày {{n_ngay_lap}}</w:t>
             </w:r>
             <w:proofErr w:type="spellEnd"/>
             <w:r>
@@ -271,7 +266,6 @@
                 <w:sz w:val="24"/>
                 <w:szCs w:val="24"/>
               </w:rPr>
-              <w:t xml:space="preserve"> </w:t>
             </w:r>
             <w:proofErr w:type="spellStart"/>
             <w:r>
@@ -281,7 +275,6 @@
                 <w:sz w:val="24"/>
                 <w:szCs w:val="24"/>
               </w:rPr>
-              <w:t>Nội</w:t>
             </w:r>
             <w:proofErr w:type="spellEnd"/>
             <w:r>
@@ -291,7 +284,6 @@
                 <w:sz w:val="24"/>
                 <w:szCs w:val="24"/>
               </w:rPr>
-              <w:t xml:space="preserve">, </w:t>
             </w:r>
             <w:proofErr w:type="spellStart"/>
             <w:r>
@@ -301,7 +293,6 @@
                 <w:sz w:val="24"/>
                 <w:szCs w:val="24"/>
               </w:rPr>
-              <w:t>ngày</w:t>
             </w:r>
             <w:proofErr w:type="spellEnd"/>
             <w:r>
@@ -311,7 +302,6 @@
                 <w:sz w:val="24"/>
                 <w:szCs w:val="24"/>
               </w:rPr>
-              <w:t xml:space="preserve">        </w:t>
             </w:r>
             <w:proofErr w:type="spellStart"/>
             <w:r>
@@ -321,7 +311,6 @@
                 <w:sz w:val="24"/>
                 <w:szCs w:val="24"/>
               </w:rPr>
-              <w:t>tháng</w:t>
             </w:r>
             <w:proofErr w:type="spellEnd"/>
             <w:r>
@@ -331,7 +320,6 @@
                 <w:sz w:val="24"/>
                 <w:szCs w:val="24"/>
               </w:rPr>
-              <w:t xml:space="preserve">        </w:t>
             </w:r>
             <w:proofErr w:type="spellStart"/>
             <w:r>
@@ -341,7 +329,6 @@
                 <w:sz w:val="24"/>
                 <w:szCs w:val="24"/>
               </w:rPr>
-              <w:t>năm</w:t>
             </w:r>
             <w:proofErr w:type="spellEnd"/>
             <w:r>
@@ -351,7 +338,6 @@
                 <w:sz w:val="24"/>
                 <w:szCs w:val="24"/>
               </w:rPr>
-              <w:t xml:space="preserve"> 2026</w:t>
             </w:r>
           </w:p>
         </w:tc>
@@ -560,7 +546,7 @@
           <w:b/>
           <w:bCs/>
         </w:rPr>
-        <w:t>Kính</w:t>
+        <w:t>Kính gửi: {{ten_don_vi}}</w:t>
       </w:r>
       <w:proofErr w:type="spellEnd"/>
       <w:r>
@@ -568,7 +554,6 @@
           <w:b/>
           <w:bCs/>
         </w:rPr>
-        <w:t xml:space="preserve"> </w:t>
       </w:r>
       <w:proofErr w:type="spellStart"/>
       <w:r>
@@ -576,7 +561,6 @@
           <w:b/>
           <w:bCs/>
         </w:rPr>
-        <w:t>gửi</w:t>
       </w:r>
       <w:proofErr w:type="spellEnd"/>
       <w:r>
@@ -584,7 +568,6 @@
           <w:b/>
           <w:bCs/>
         </w:rPr>
-        <w:t xml:space="preserve">: </w:t>
       </w:r>
       <w:proofErr w:type="spellStart"/>
       <w:r>
@@ -592,7 +575,6 @@
           <w:b/>
           <w:bCs/>
         </w:rPr>
-        <w:t>Ủy</w:t>
       </w:r>
       <w:proofErr w:type="spellEnd"/>
       <w:r>
@@ -600,7 +582,6 @@
           <w:b/>
           <w:bCs/>
         </w:rPr>
-        <w:t xml:space="preserve"> ban </w:t>
       </w:r>
       <w:proofErr w:type="spellStart"/>
       <w:r>
@@ -608,7 +589,6 @@
           <w:b/>
           <w:bCs/>
         </w:rPr>
-        <w:t>nhân</w:t>
       </w:r>
       <w:proofErr w:type="spellEnd"/>
       <w:r>
@@ -616,7 +596,6 @@
           <w:b/>
           <w:bCs/>
         </w:rPr>
-        <w:t xml:space="preserve"> </w:t>
       </w:r>
       <w:proofErr w:type="spellStart"/>
       <w:r>
@@ -624,7 +603,6 @@
           <w:b/>
           <w:bCs/>
         </w:rPr>
-        <w:t>dân</w:t>
       </w:r>
       <w:proofErr w:type="spellEnd"/>
       <w:r>
@@ -632,7 +610,6 @@
           <w:b/>
           <w:bCs/>
         </w:rPr>
-        <w:t xml:space="preserve"> </w:t>
       </w:r>
       <w:proofErr w:type="spellStart"/>
       <w:r>
@@ -640,7 +617,6 @@
           <w:b/>
           <w:bCs/>
         </w:rPr>
-        <w:t>xã</w:t>
       </w:r>
       <w:proofErr w:type="spellEnd"/>
       <w:r>
@@ -648,7 +624,6 @@
           <w:b/>
           <w:bCs/>
         </w:rPr>
-        <w:t xml:space="preserve"> </w:t>
       </w:r>
       <w:proofErr w:type="spellStart"/>
       <w:r>
@@ -656,7 +631,6 @@
           <w:b/>
           <w:bCs/>
         </w:rPr>
-        <w:t>Lý</w:t>
       </w:r>
       <w:proofErr w:type="spellEnd"/>
       <w:r>
@@ -664,7 +638,6 @@
           <w:b/>
           <w:bCs/>
         </w:rPr>
-        <w:t xml:space="preserve"> </w:t>
       </w:r>
       <w:proofErr w:type="spellStart"/>
       <w:r>
@@ -672,7 +645,6 @@
           <w:b/>
           <w:bCs/>
         </w:rPr>
-        <w:t>Nhân</w:t>
       </w:r>
       <w:proofErr w:type="spellEnd"/>
     </w:p>
@@ -689,183 +661,95 @@
       </w:pPr>
       <w:proofErr w:type="spellStart"/>
       <w:r>
-        <w:t>MobiFone</w:t>
-      </w:r>
-      <w:proofErr w:type="spellEnd"/>
-      <w:r>
-        <w:t xml:space="preserve"> </w:t>
-      </w:r>
-      <w:proofErr w:type="spellStart"/>
-      <w:r>
-        <w:t>Tỉnh</w:t>
-      </w:r>
-      <w:proofErr w:type="spellEnd"/>
-      <w:r>
-        <w:t xml:space="preserve"> Ninh Bình</w:t>
-      </w:r>
-      <w:r>
-        <w:t xml:space="preserve"> – chi </w:t>
-      </w:r>
-      <w:proofErr w:type="spellStart"/>
-      <w:r>
-        <w:t>nhánh</w:t>
-      </w:r>
-      <w:proofErr w:type="spellEnd"/>
-      <w:r>
-        <w:t xml:space="preserve"> </w:t>
-      </w:r>
-      <w:proofErr w:type="spellStart"/>
-      <w:r>
-        <w:t>Tổng</w:t>
-      </w:r>
-      <w:proofErr w:type="spellEnd"/>
-      <w:r>
-        <w:t xml:space="preserve"> Công ty </w:t>
-      </w:r>
-      <w:proofErr w:type="spellStart"/>
-      <w:r>
-        <w:t>viễn</w:t>
-      </w:r>
-      <w:proofErr w:type="spellEnd"/>
-      <w:r>
-        <w:t xml:space="preserve"> </w:t>
-      </w:r>
-      <w:proofErr w:type="spellStart"/>
-      <w:r>
-        <w:t>thông</w:t>
-      </w:r>
-      <w:proofErr w:type="spellEnd"/>
-      <w:r>
-        <w:t xml:space="preserve"> </w:t>
-      </w:r>
-      <w:proofErr w:type="spellStart"/>
-      <w:r>
-        <w:t>MobiFone</w:t>
-      </w:r>
-      <w:proofErr w:type="spellEnd"/>
-      <w:r>
-        <w:t xml:space="preserve"> (</w:t>
-      </w:r>
-      <w:proofErr w:type="spellStart"/>
-      <w:r>
-        <w:t>MobiFone</w:t>
-      </w:r>
-      <w:proofErr w:type="spellEnd"/>
-      <w:r>
-        <w:t xml:space="preserve">) </w:t>
-      </w:r>
-      <w:proofErr w:type="spellStart"/>
-      <w:r>
-        <w:t>xin</w:t>
-      </w:r>
-      <w:proofErr w:type="spellEnd"/>
-      <w:r>
-        <w:t xml:space="preserve"> </w:t>
-      </w:r>
-      <w:proofErr w:type="spellStart"/>
-      <w:r>
-        <w:t>gửi</w:t>
-      </w:r>
-      <w:proofErr w:type="spellEnd"/>
-      <w:r>
-        <w:t xml:space="preserve"> </w:t>
-      </w:r>
-      <w:proofErr w:type="spellStart"/>
-      <w:r>
-        <w:t>lời</w:t>
-      </w:r>
-      <w:proofErr w:type="spellEnd"/>
-      <w:r>
-        <w:t xml:space="preserve"> </w:t>
-      </w:r>
-      <w:proofErr w:type="spellStart"/>
-      <w:r>
-        <w:t>chào</w:t>
-      </w:r>
-      <w:proofErr w:type="spellEnd"/>
-      <w:r>
-        <w:t xml:space="preserve"> </w:t>
-      </w:r>
-      <w:proofErr w:type="spellStart"/>
-      <w:r>
-        <w:t>trân</w:t>
-      </w:r>
-      <w:proofErr w:type="spellEnd"/>
-      <w:r>
-        <w:t xml:space="preserve"> </w:t>
-      </w:r>
-      <w:proofErr w:type="spellStart"/>
-      <w:r>
-        <w:t>trọng</w:t>
-      </w:r>
-      <w:proofErr w:type="spellEnd"/>
-      <w:r>
-        <w:t xml:space="preserve"> </w:t>
-      </w:r>
-      <w:proofErr w:type="spellStart"/>
-      <w:r>
-        <w:t>đến</w:t>
-      </w:r>
-      <w:proofErr w:type="spellEnd"/>
-      <w:r>
-        <w:t xml:space="preserve"> Quý </w:t>
-      </w:r>
-      <w:proofErr w:type="spellStart"/>
-      <w:r>
-        <w:t>Ủy</w:t>
-      </w:r>
-      <w:proofErr w:type="spellEnd"/>
-      <w:r>
-        <w:t xml:space="preserve"> ban </w:t>
-      </w:r>
-      <w:proofErr w:type="spellStart"/>
-      <w:r>
-        <w:t>nhân</w:t>
-      </w:r>
-      <w:proofErr w:type="spellEnd"/>
-      <w:r>
-        <w:t xml:space="preserve"> </w:t>
-      </w:r>
-      <w:proofErr w:type="spellStart"/>
-      <w:r>
-        <w:t>dân</w:t>
-      </w:r>
-      <w:proofErr w:type="spellEnd"/>
-      <w:r>
-        <w:t xml:space="preserve"> </w:t>
-      </w:r>
-      <w:proofErr w:type="spellStart"/>
-      <w:r>
-        <w:t>xã</w:t>
-      </w:r>
-      <w:proofErr w:type="spellEnd"/>
-      <w:r>
-        <w:t xml:space="preserve"> </w:t>
-      </w:r>
-      <w:proofErr w:type="spellStart"/>
-      <w:r>
-        <w:t>Lý</w:t>
-      </w:r>
-      <w:proofErr w:type="spellEnd"/>
-      <w:r>
-        <w:t xml:space="preserve"> </w:t>
-      </w:r>
-      <w:proofErr w:type="spellStart"/>
-      <w:r>
-        <w:t>Nhân</w:t>
-      </w:r>
-      <w:proofErr w:type="spellEnd"/>
-      <w:r>
-        <w:t xml:space="preserve"> (Quý </w:t>
-      </w:r>
-      <w:proofErr w:type="spellStart"/>
-      <w:r>
-        <w:t>Ủy</w:t>
-      </w:r>
-      <w:proofErr w:type="spellEnd"/>
-      <w:r>
-        <w:t xml:space="preserve"> ban).</w:t>
-      </w:r>
+        <w:t>{{BC_don_vi_thuc_hien}} Tỉnh {{BC_ten_tinh}} – chi nhánh Tổng Công ty viễn thông {{BC_don_vi_thuc_hien}} ({{BC_don_vi_thuc_hien}}) xin gửi lời chào trân trọng đến Quý {{ten_don_vi}} (Quý Ủy ban).</w:t>
+      </w:r>
+      <w:proofErr w:type="spellEnd"/>
+      <w:r/>
+      <w:proofErr w:type="spellStart"/>
+      <w:r/>
+      <w:proofErr w:type="spellEnd"/>
+      <w:r/>
+      <w:r/>
+      <w:proofErr w:type="spellStart"/>
+      <w:r/>
+      <w:proofErr w:type="spellEnd"/>
+      <w:r/>
+      <w:proofErr w:type="spellStart"/>
+      <w:r/>
+      <w:proofErr w:type="spellEnd"/>
+      <w:r/>
+      <w:proofErr w:type="spellStart"/>
+      <w:r/>
+      <w:proofErr w:type="spellEnd"/>
+      <w:r/>
+      <w:proofErr w:type="spellStart"/>
+      <w:r/>
+      <w:proofErr w:type="spellEnd"/>
+      <w:r/>
+      <w:proofErr w:type="spellStart"/>
+      <w:r/>
+      <w:proofErr w:type="spellEnd"/>
+      <w:r/>
+      <w:proofErr w:type="spellStart"/>
+      <w:r/>
+      <w:proofErr w:type="spellEnd"/>
+      <w:r/>
+      <w:proofErr w:type="spellStart"/>
+      <w:r/>
+      <w:proofErr w:type="spellEnd"/>
+      <w:r/>
+      <w:proofErr w:type="spellStart"/>
+      <w:r/>
+      <w:proofErr w:type="spellEnd"/>
+      <w:r/>
+      <w:proofErr w:type="spellStart"/>
+      <w:r/>
+      <w:proofErr w:type="spellEnd"/>
+      <w:r/>
+      <w:proofErr w:type="spellStart"/>
+      <w:r/>
+      <w:proofErr w:type="spellEnd"/>
+      <w:r/>
+      <w:proofErr w:type="spellStart"/>
+      <w:r/>
+      <w:proofErr w:type="spellEnd"/>
+      <w:r/>
+      <w:proofErr w:type="spellStart"/>
+      <w:r/>
+      <w:proofErr w:type="spellEnd"/>
+      <w:r/>
+      <w:proofErr w:type="spellStart"/>
+      <w:r/>
+      <w:proofErr w:type="spellEnd"/>
+      <w:r/>
+      <w:proofErr w:type="spellStart"/>
+      <w:r/>
+      <w:proofErr w:type="spellEnd"/>
+      <w:r/>
+      <w:proofErr w:type="spellStart"/>
+      <w:r/>
+      <w:proofErr w:type="spellEnd"/>
+      <w:r/>
+      <w:proofErr w:type="spellStart"/>
+      <w:r/>
+      <w:proofErr w:type="spellEnd"/>
+      <w:r/>
+      <w:proofErr w:type="spellStart"/>
+      <w:r/>
+      <w:proofErr w:type="spellEnd"/>
+      <w:r/>
+      <w:proofErr w:type="spellStart"/>
+      <w:r/>
+      <w:proofErr w:type="spellEnd"/>
+      <w:r/>
+      <w:proofErr w:type="spellStart"/>
+      <w:r/>
+      <w:proofErr w:type="spellEnd"/>
+      <w:r/>
+      <w:proofErr w:type="spellStart"/>
+      <w:r/>
+      <w:proofErr w:type="spellEnd"/>
+      <w:r/>
     </w:p>
     <w:p>
       <w:pPr>
@@ -875,420 +759,214 @@
       </w:pPr>
       <w:proofErr w:type="spellStart"/>
       <w:r>
-        <w:t>Căn</w:t>
-      </w:r>
-      <w:proofErr w:type="spellEnd"/>
-      <w:r>
-        <w:t xml:space="preserve"> </w:t>
-      </w:r>
-      <w:proofErr w:type="spellStart"/>
-      <w:r>
-        <w:t>cứ</w:t>
-      </w:r>
-      <w:proofErr w:type="spellEnd"/>
-      <w:r>
-        <w:t xml:space="preserve"> </w:t>
-      </w:r>
-      <w:proofErr w:type="spellStart"/>
-      <w:r>
-        <w:t>vào</w:t>
-      </w:r>
-      <w:proofErr w:type="spellEnd"/>
-      <w:r>
-        <w:t xml:space="preserve"> </w:t>
-      </w:r>
-      <w:proofErr w:type="spellStart"/>
-      <w:r>
-        <w:t>buổi</w:t>
-      </w:r>
-      <w:proofErr w:type="spellEnd"/>
-      <w:r>
-        <w:t xml:space="preserve"> </w:t>
-      </w:r>
-      <w:proofErr w:type="spellStart"/>
-      <w:r>
-        <w:t>làm</w:t>
-      </w:r>
-      <w:proofErr w:type="spellEnd"/>
-      <w:r>
-        <w:t xml:space="preserve"> </w:t>
-      </w:r>
-      <w:proofErr w:type="spellStart"/>
-      <w:r>
-        <w:t>việc</w:t>
-      </w:r>
-      <w:proofErr w:type="spellEnd"/>
-      <w:r>
-        <w:t xml:space="preserve"> </w:t>
-      </w:r>
-      <w:proofErr w:type="spellStart"/>
-      <w:r>
-        <w:t>trực</w:t>
-      </w:r>
-      <w:proofErr w:type="spellEnd"/>
-      <w:r>
-        <w:t xml:space="preserve"> </w:t>
-      </w:r>
-      <w:proofErr w:type="spellStart"/>
-      <w:r>
-        <w:t>tiếp</w:t>
-      </w:r>
-      <w:proofErr w:type="spellEnd"/>
-      <w:r>
-        <w:t xml:space="preserve"> </w:t>
-      </w:r>
-      <w:proofErr w:type="spellStart"/>
-      <w:r>
-        <w:t>với</w:t>
-      </w:r>
-      <w:proofErr w:type="spellEnd"/>
-      <w:r>
-        <w:t xml:space="preserve"> Quý </w:t>
-      </w:r>
-      <w:proofErr w:type="spellStart"/>
-      <w:r>
-        <w:t>Ủy</w:t>
-      </w:r>
-      <w:proofErr w:type="spellEnd"/>
-      <w:r>
-        <w:t xml:space="preserve"> ban </w:t>
-      </w:r>
-      <w:proofErr w:type="spellStart"/>
-      <w:r>
-        <w:t>về</w:t>
-      </w:r>
-      <w:proofErr w:type="spellEnd"/>
-      <w:r>
-        <w:t xml:space="preserve"> </w:t>
-      </w:r>
-      <w:proofErr w:type="spellStart"/>
-      <w:r>
-        <w:t>việc</w:t>
-      </w:r>
-      <w:proofErr w:type="spellEnd"/>
-      <w:r>
-        <w:t xml:space="preserve"> </w:t>
-      </w:r>
-      <w:proofErr w:type="spellStart"/>
-      <w:r>
-        <w:t>tư</w:t>
-      </w:r>
-      <w:proofErr w:type="spellEnd"/>
-      <w:r>
-        <w:t xml:space="preserve"> </w:t>
-      </w:r>
-      <w:proofErr w:type="spellStart"/>
-      <w:r>
-        <w:t>vấn</w:t>
-      </w:r>
-      <w:proofErr w:type="spellEnd"/>
-      <w:r>
-        <w:t xml:space="preserve"> </w:t>
-      </w:r>
-      <w:proofErr w:type="spellStart"/>
-      <w:r>
-        <w:t>đánh</w:t>
-      </w:r>
-      <w:proofErr w:type="spellEnd"/>
-      <w:r>
-        <w:t xml:space="preserve"> </w:t>
-      </w:r>
-      <w:proofErr w:type="spellStart"/>
-      <w:r>
-        <w:t>giá</w:t>
-      </w:r>
-      <w:proofErr w:type="spellEnd"/>
-      <w:r>
-        <w:t xml:space="preserve"> </w:t>
-      </w:r>
-      <w:proofErr w:type="spellStart"/>
-      <w:r>
-        <w:t>về</w:t>
-      </w:r>
-      <w:proofErr w:type="spellEnd"/>
-      <w:r>
-        <w:t xml:space="preserve"> an </w:t>
-      </w:r>
-      <w:proofErr w:type="spellStart"/>
-      <w:r>
-        <w:t>toàn</w:t>
-      </w:r>
-      <w:proofErr w:type="spellEnd"/>
-      <w:r>
-        <w:t xml:space="preserve"> </w:t>
-      </w:r>
-      <w:proofErr w:type="spellStart"/>
-      <w:r>
-        <w:t>thông</w:t>
-      </w:r>
-      <w:proofErr w:type="spellEnd"/>
-      <w:r>
-        <w:t xml:space="preserve"> tin (ATTT) </w:t>
-      </w:r>
-      <w:proofErr w:type="spellStart"/>
-      <w:r>
-        <w:t>theo</w:t>
-      </w:r>
-      <w:proofErr w:type="spellEnd"/>
-      <w:r>
-        <w:t xml:space="preserve"> </w:t>
-      </w:r>
-      <w:proofErr w:type="spellStart"/>
-      <w:r>
-        <w:t>cấp</w:t>
-      </w:r>
-      <w:proofErr w:type="spellEnd"/>
-      <w:r>
-        <w:t xml:space="preserve"> </w:t>
-      </w:r>
-      <w:proofErr w:type="spellStart"/>
-      <w:r>
-        <w:t>độ</w:t>
-      </w:r>
-      <w:proofErr w:type="spellEnd"/>
-      <w:r>
-        <w:t xml:space="preserve"> </w:t>
-      </w:r>
-      <w:proofErr w:type="spellStart"/>
-      <w:r>
-        <w:t>để</w:t>
-      </w:r>
-      <w:proofErr w:type="spellEnd"/>
-      <w:r>
-        <w:t xml:space="preserve"> </w:t>
-      </w:r>
-      <w:proofErr w:type="spellStart"/>
-      <w:r>
-        <w:t>nắm</w:t>
-      </w:r>
-      <w:proofErr w:type="spellEnd"/>
-      <w:r>
-        <w:t xml:space="preserve"> </w:t>
-      </w:r>
-      <w:proofErr w:type="spellStart"/>
-      <w:r>
-        <w:t>bắt</w:t>
-      </w:r>
-      <w:proofErr w:type="spellEnd"/>
-      <w:r>
-        <w:t xml:space="preserve"> </w:t>
-      </w:r>
-      <w:proofErr w:type="spellStart"/>
-      <w:r>
-        <w:t>nhu</w:t>
-      </w:r>
-      <w:proofErr w:type="spellEnd"/>
-      <w:r>
-        <w:t xml:space="preserve"> </w:t>
-      </w:r>
-      <w:proofErr w:type="spellStart"/>
-      <w:r>
-        <w:t>cầu</w:t>
-      </w:r>
-      <w:proofErr w:type="spellEnd"/>
-      <w:r>
-        <w:t xml:space="preserve"> </w:t>
-      </w:r>
-      <w:proofErr w:type="spellStart"/>
-      <w:r>
-        <w:t>tư</w:t>
-      </w:r>
-      <w:proofErr w:type="spellEnd"/>
-      <w:r>
-        <w:t xml:space="preserve"> </w:t>
-      </w:r>
-      <w:proofErr w:type="spellStart"/>
-      <w:r>
-        <w:t>vấn</w:t>
-      </w:r>
-      <w:proofErr w:type="spellEnd"/>
-      <w:r>
-        <w:t xml:space="preserve"> </w:t>
-      </w:r>
-      <w:proofErr w:type="spellStart"/>
-      <w:r>
-        <w:t>xây</w:t>
-      </w:r>
-      <w:proofErr w:type="spellEnd"/>
-      <w:r>
-        <w:t xml:space="preserve"> </w:t>
-      </w:r>
-      <w:proofErr w:type="spellStart"/>
-      <w:r>
-        <w:t>dựng</w:t>
-      </w:r>
-      <w:proofErr w:type="spellEnd"/>
-      <w:r>
-        <w:t xml:space="preserve"> </w:t>
-      </w:r>
-      <w:proofErr w:type="spellStart"/>
-      <w:r>
-        <w:t>hồ</w:t>
-      </w:r>
-      <w:proofErr w:type="spellEnd"/>
-      <w:r>
-        <w:t xml:space="preserve"> </w:t>
-      </w:r>
-      <w:proofErr w:type="spellStart"/>
-      <w:r>
-        <w:t>sơ</w:t>
-      </w:r>
-      <w:proofErr w:type="spellEnd"/>
-      <w:r>
-        <w:t xml:space="preserve"> </w:t>
-      </w:r>
-      <w:proofErr w:type="spellStart"/>
-      <w:r>
-        <w:t>cấp</w:t>
-      </w:r>
-      <w:proofErr w:type="spellEnd"/>
-      <w:r>
-        <w:t xml:space="preserve"> </w:t>
-      </w:r>
-      <w:proofErr w:type="spellStart"/>
-      <w:r>
-        <w:t>độ</w:t>
-      </w:r>
-      <w:proofErr w:type="spellEnd"/>
-      <w:r>
-        <w:t xml:space="preserve"> </w:t>
-      </w:r>
-      <w:proofErr w:type="spellStart"/>
-      <w:r>
-        <w:t>bảo</w:t>
-      </w:r>
-      <w:proofErr w:type="spellEnd"/>
-      <w:r>
-        <w:t xml:space="preserve"> </w:t>
-      </w:r>
-      <w:proofErr w:type="spellStart"/>
-      <w:r>
-        <w:t>đảm</w:t>
-      </w:r>
-      <w:proofErr w:type="spellEnd"/>
-      <w:r>
-        <w:t xml:space="preserve"> ATTT </w:t>
-      </w:r>
-      <w:proofErr w:type="spellStart"/>
-      <w:r>
-        <w:t>của</w:t>
-      </w:r>
-      <w:proofErr w:type="spellEnd"/>
-      <w:r>
-        <w:t xml:space="preserve"> Quý </w:t>
-      </w:r>
-      <w:proofErr w:type="spellStart"/>
-      <w:r>
-        <w:t>Ủy</w:t>
-      </w:r>
-      <w:proofErr w:type="spellEnd"/>
-      <w:r>
-        <w:t xml:space="preserve"> ban, </w:t>
-      </w:r>
-      <w:proofErr w:type="spellStart"/>
-      <w:r>
-        <w:t>MobiFone</w:t>
-      </w:r>
-      <w:proofErr w:type="spellEnd"/>
-      <w:r>
-        <w:t xml:space="preserve"> </w:t>
-      </w:r>
-      <w:proofErr w:type="spellStart"/>
-      <w:r>
-        <w:t>đã</w:t>
-      </w:r>
-      <w:proofErr w:type="spellEnd"/>
-      <w:r>
-        <w:t xml:space="preserve"> </w:t>
-      </w:r>
-      <w:proofErr w:type="spellStart"/>
-      <w:r>
-        <w:t>tiến</w:t>
-      </w:r>
-      <w:proofErr w:type="spellEnd"/>
-      <w:r>
-        <w:t xml:space="preserve"> </w:t>
-      </w:r>
-      <w:proofErr w:type="spellStart"/>
-      <w:r>
-        <w:t>hành</w:t>
-      </w:r>
-      <w:proofErr w:type="spellEnd"/>
-      <w:r>
-        <w:t xml:space="preserve"> </w:t>
-      </w:r>
-      <w:proofErr w:type="spellStart"/>
-      <w:r>
-        <w:t>khảo</w:t>
-      </w:r>
-      <w:proofErr w:type="spellEnd"/>
-      <w:r>
-        <w:t xml:space="preserve"> </w:t>
-      </w:r>
-      <w:proofErr w:type="spellStart"/>
-      <w:r>
-        <w:t>sát</w:t>
-      </w:r>
-      <w:proofErr w:type="spellEnd"/>
-      <w:r>
-        <w:t xml:space="preserve"> </w:t>
-      </w:r>
-      <w:proofErr w:type="spellStart"/>
-      <w:r>
-        <w:t>và</w:t>
-      </w:r>
-      <w:proofErr w:type="spellEnd"/>
-      <w:r>
-        <w:t xml:space="preserve"> </w:t>
-      </w:r>
-      <w:proofErr w:type="spellStart"/>
-      <w:r>
-        <w:t>xin</w:t>
-      </w:r>
-      <w:proofErr w:type="spellEnd"/>
-      <w:r>
-        <w:t xml:space="preserve"> </w:t>
-      </w:r>
-      <w:proofErr w:type="spellStart"/>
-      <w:r>
-        <w:t>được</w:t>
-      </w:r>
-      <w:proofErr w:type="spellEnd"/>
-      <w:r>
-        <w:t xml:space="preserve"> </w:t>
-      </w:r>
-      <w:proofErr w:type="spellStart"/>
-      <w:r>
-        <w:t>báo</w:t>
-      </w:r>
-      <w:proofErr w:type="spellEnd"/>
-      <w:r>
-        <w:t xml:space="preserve"> </w:t>
-      </w:r>
-      <w:proofErr w:type="spellStart"/>
-      <w:r>
-        <w:t>cáo</w:t>
-      </w:r>
-      <w:proofErr w:type="spellEnd"/>
-      <w:r>
-        <w:t xml:space="preserve"> </w:t>
-      </w:r>
-      <w:proofErr w:type="spellStart"/>
-      <w:r>
-        <w:t>như</w:t>
-      </w:r>
-      <w:proofErr w:type="spellEnd"/>
-      <w:r>
-        <w:t xml:space="preserve"> </w:t>
-      </w:r>
-      <w:proofErr w:type="spellStart"/>
-      <w:r>
-        <w:t>sau</w:t>
-      </w:r>
-      <w:proofErr w:type="spellEnd"/>
-      <w:r>
-        <w:t>:</w:t>
-      </w:r>
+        <w:t>Căn cứ vào buổi làm việc trực tiếp với Quý Ủy ban về việc tư vấn đánh giá về an toàn thông tin (ATTT) theo cấp độ để nắm bắt nhu cầu tư vấn xây dựng hồ sơ cấp độ bảo đảm ATTT của Quý Ủy ban, {{BC_don_vi_thuc_hien}} đã tiến hành khảo sát và xin được báo cáo như sau:</w:t>
+      </w:r>
+      <w:proofErr w:type="spellEnd"/>
+      <w:r/>
+      <w:proofErr w:type="spellStart"/>
+      <w:r/>
+      <w:proofErr w:type="spellEnd"/>
+      <w:r/>
+      <w:proofErr w:type="spellStart"/>
+      <w:r/>
+      <w:proofErr w:type="spellEnd"/>
+      <w:r/>
+      <w:proofErr w:type="spellStart"/>
+      <w:r/>
+      <w:proofErr w:type="spellEnd"/>
+      <w:r/>
+      <w:proofErr w:type="spellStart"/>
+      <w:r/>
+      <w:proofErr w:type="spellEnd"/>
+      <w:r/>
+      <w:proofErr w:type="spellStart"/>
+      <w:r/>
+      <w:proofErr w:type="spellEnd"/>
+      <w:r/>
+      <w:proofErr w:type="spellStart"/>
+      <w:r/>
+      <w:proofErr w:type="spellEnd"/>
+      <w:r/>
+      <w:proofErr w:type="spellStart"/>
+      <w:r/>
+      <w:proofErr w:type="spellEnd"/>
+      <w:r/>
+      <w:proofErr w:type="spellStart"/>
+      <w:r/>
+      <w:proofErr w:type="spellEnd"/>
+      <w:r/>
+      <w:proofErr w:type="spellStart"/>
+      <w:r/>
+      <w:proofErr w:type="spellEnd"/>
+      <w:r/>
+      <w:proofErr w:type="spellStart"/>
+      <w:r/>
+      <w:proofErr w:type="spellEnd"/>
+      <w:r/>
+      <w:proofErr w:type="spellStart"/>
+      <w:r/>
+      <w:proofErr w:type="spellEnd"/>
+      <w:r/>
+      <w:proofErr w:type="spellStart"/>
+      <w:r/>
+      <w:proofErr w:type="spellEnd"/>
+      <w:r/>
+      <w:proofErr w:type="spellStart"/>
+      <w:r/>
+      <w:proofErr w:type="spellEnd"/>
+      <w:r/>
+      <w:proofErr w:type="spellStart"/>
+      <w:r/>
+      <w:proofErr w:type="spellEnd"/>
+      <w:r/>
+      <w:proofErr w:type="spellStart"/>
+      <w:r/>
+      <w:proofErr w:type="spellEnd"/>
+      <w:r/>
+      <w:proofErr w:type="spellStart"/>
+      <w:r/>
+      <w:proofErr w:type="spellEnd"/>
+      <w:r/>
+      <w:proofErr w:type="spellStart"/>
+      <w:r/>
+      <w:proofErr w:type="spellEnd"/>
+      <w:r/>
+      <w:proofErr w:type="spellStart"/>
+      <w:r/>
+      <w:proofErr w:type="spellEnd"/>
+      <w:r/>
+      <w:proofErr w:type="spellStart"/>
+      <w:r/>
+      <w:proofErr w:type="spellEnd"/>
+      <w:r/>
+      <w:proofErr w:type="spellStart"/>
+      <w:r/>
+      <w:proofErr w:type="spellEnd"/>
+      <w:r/>
+      <w:proofErr w:type="spellStart"/>
+      <w:r/>
+      <w:proofErr w:type="spellEnd"/>
+      <w:r/>
+      <w:proofErr w:type="spellStart"/>
+      <w:r/>
+      <w:proofErr w:type="spellEnd"/>
+      <w:r/>
+      <w:proofErr w:type="spellStart"/>
+      <w:r/>
+      <w:proofErr w:type="spellEnd"/>
+      <w:r/>
+      <w:proofErr w:type="spellStart"/>
+      <w:r/>
+      <w:proofErr w:type="spellEnd"/>
+      <w:r/>
+      <w:proofErr w:type="spellStart"/>
+      <w:r/>
+      <w:proofErr w:type="spellEnd"/>
+      <w:r/>
+      <w:proofErr w:type="spellStart"/>
+      <w:r/>
+      <w:proofErr w:type="spellEnd"/>
+      <w:r/>
+      <w:proofErr w:type="spellStart"/>
+      <w:r/>
+      <w:proofErr w:type="spellEnd"/>
+      <w:r/>
+      <w:proofErr w:type="spellStart"/>
+      <w:r/>
+      <w:proofErr w:type="spellEnd"/>
+      <w:r/>
+      <w:proofErr w:type="spellStart"/>
+      <w:r/>
+      <w:proofErr w:type="spellEnd"/>
+      <w:r/>
+      <w:proofErr w:type="spellStart"/>
+      <w:r/>
+      <w:proofErr w:type="spellEnd"/>
+      <w:r/>
+      <w:proofErr w:type="spellStart"/>
+      <w:r/>
+      <w:proofErr w:type="spellEnd"/>
+      <w:r/>
+      <w:proofErr w:type="spellStart"/>
+      <w:r/>
+      <w:proofErr w:type="spellEnd"/>
+      <w:r/>
+      <w:proofErr w:type="spellStart"/>
+      <w:r/>
+      <w:proofErr w:type="spellEnd"/>
+      <w:r/>
+      <w:proofErr w:type="spellStart"/>
+      <w:r/>
+      <w:proofErr w:type="spellEnd"/>
+      <w:r/>
+      <w:proofErr w:type="spellStart"/>
+      <w:r/>
+      <w:proofErr w:type="spellEnd"/>
+      <w:r/>
+      <w:proofErr w:type="spellStart"/>
+      <w:r/>
+      <w:proofErr w:type="spellEnd"/>
+      <w:r/>
+      <w:proofErr w:type="spellStart"/>
+      <w:r/>
+      <w:proofErr w:type="spellEnd"/>
+      <w:r/>
+      <w:proofErr w:type="spellStart"/>
+      <w:r/>
+      <w:proofErr w:type="spellEnd"/>
+      <w:r/>
+      <w:proofErr w:type="spellStart"/>
+      <w:r/>
+      <w:proofErr w:type="spellEnd"/>
+      <w:r/>
+      <w:proofErr w:type="spellStart"/>
+      <w:r/>
+      <w:proofErr w:type="spellEnd"/>
+      <w:r/>
+      <w:proofErr w:type="spellStart"/>
+      <w:r/>
+      <w:proofErr w:type="spellEnd"/>
+      <w:r/>
+      <w:proofErr w:type="spellStart"/>
+      <w:r/>
+      <w:proofErr w:type="spellEnd"/>
+      <w:r/>
+      <w:proofErr w:type="spellStart"/>
+      <w:r/>
+      <w:proofErr w:type="spellEnd"/>
+      <w:r/>
+      <w:proofErr w:type="spellStart"/>
+      <w:r/>
+      <w:proofErr w:type="spellEnd"/>
+      <w:r/>
+      <w:proofErr w:type="spellStart"/>
+      <w:r/>
+      <w:proofErr w:type="spellEnd"/>
+      <w:r/>
+      <w:proofErr w:type="spellStart"/>
+      <w:r/>
+      <w:proofErr w:type="spellEnd"/>
+      <w:r/>
+      <w:proofErr w:type="spellStart"/>
+      <w:r/>
+      <w:proofErr w:type="spellEnd"/>
+      <w:r/>
+      <w:proofErr w:type="spellStart"/>
+      <w:r/>
+      <w:proofErr w:type="spellEnd"/>
+      <w:r/>
+      <w:proofErr w:type="spellStart"/>
+      <w:r/>
+      <w:proofErr w:type="spellEnd"/>
+      <w:r/>
+      <w:proofErr w:type="spellStart"/>
+      <w:r/>
+      <w:proofErr w:type="spellEnd"/>
+      <w:r/>
+      <w:proofErr w:type="spellStart"/>
+      <w:r/>
+      <w:proofErr w:type="spellEnd"/>
+      <w:r/>
     </w:p>
     <w:p>
       <w:pPr>
@@ -1926,206 +1604,106 @@
         <w:jc w:val="both"/>
       </w:pPr>
       <w:r>
-        <w:t xml:space="preserve">- </w:t>
-      </w:r>
-      <w:proofErr w:type="spellStart"/>
-      <w:r>
-        <w:t>Căn</w:t>
-      </w:r>
-      <w:proofErr w:type="spellEnd"/>
-      <w:r>
-        <w:t xml:space="preserve"> </w:t>
-      </w:r>
-      <w:proofErr w:type="spellStart"/>
-      <w:r>
-        <w:t>cứ</w:t>
-      </w:r>
-      <w:proofErr w:type="spellEnd"/>
-      <w:r>
-        <w:t xml:space="preserve"> </w:t>
-      </w:r>
-      <w:proofErr w:type="spellStart"/>
-      <w:r>
-        <w:t>Quyết</w:t>
-      </w:r>
-      <w:proofErr w:type="spellEnd"/>
-      <w:r>
-        <w:t xml:space="preserve"> </w:t>
-      </w:r>
-      <w:proofErr w:type="spellStart"/>
-      <w:r>
-        <w:t>định</w:t>
-      </w:r>
-      <w:proofErr w:type="spellEnd"/>
-      <w:r>
-        <w:t xml:space="preserve"> </w:t>
-      </w:r>
-      <w:proofErr w:type="spellStart"/>
-      <w:r>
-        <w:t>số</w:t>
-      </w:r>
-      <w:proofErr w:type="spellEnd"/>
-      <w:r>
-        <w:t xml:space="preserve"> 2223/QĐ-UBND </w:t>
-      </w:r>
-      <w:proofErr w:type="spellStart"/>
-      <w:r>
-        <w:t>ngày</w:t>
-      </w:r>
-      <w:proofErr w:type="spellEnd"/>
-      <w:r>
-        <w:t xml:space="preserve"> 14/4/2023 </w:t>
-      </w:r>
-      <w:proofErr w:type="spellStart"/>
-      <w:r>
-        <w:t>của</w:t>
-      </w:r>
-      <w:proofErr w:type="spellEnd"/>
-      <w:r>
-        <w:t xml:space="preserve"> UBND </w:t>
-      </w:r>
-      <w:proofErr w:type="spellStart"/>
-      <w:r>
-        <w:t>Tỉnh</w:t>
-      </w:r>
-      <w:proofErr w:type="spellEnd"/>
-      <w:r>
-        <w:t xml:space="preserve"> Ninh Bình</w:t>
-      </w:r>
-      <w:r>
-        <w:t xml:space="preserve"> ban </w:t>
-      </w:r>
-      <w:proofErr w:type="spellStart"/>
-      <w:r>
-        <w:t>hành</w:t>
-      </w:r>
-      <w:proofErr w:type="spellEnd"/>
-      <w:r>
-        <w:t xml:space="preserve"> Quy </w:t>
-      </w:r>
-      <w:proofErr w:type="spellStart"/>
-      <w:r>
-        <w:t>chế</w:t>
-      </w:r>
-      <w:proofErr w:type="spellEnd"/>
-      <w:r>
-        <w:t xml:space="preserve"> </w:t>
-      </w:r>
-      <w:proofErr w:type="spellStart"/>
-      <w:r>
-        <w:t>bảo</w:t>
-      </w:r>
-      <w:proofErr w:type="spellEnd"/>
-      <w:r>
-        <w:t xml:space="preserve"> </w:t>
-      </w:r>
-      <w:proofErr w:type="spellStart"/>
-      <w:r>
-        <w:t>đảm</w:t>
-      </w:r>
-      <w:proofErr w:type="spellEnd"/>
-      <w:r>
-        <w:t xml:space="preserve"> an </w:t>
-      </w:r>
-      <w:proofErr w:type="spellStart"/>
-      <w:r>
-        <w:t>toàn</w:t>
-      </w:r>
-      <w:proofErr w:type="spellEnd"/>
-      <w:r>
-        <w:t xml:space="preserve"> </w:t>
-      </w:r>
-      <w:proofErr w:type="spellStart"/>
-      <w:r>
-        <w:t>thông</w:t>
-      </w:r>
-      <w:proofErr w:type="spellEnd"/>
-      <w:r>
-        <w:t xml:space="preserve"> tin </w:t>
-      </w:r>
-      <w:proofErr w:type="spellStart"/>
-      <w:r>
-        <w:t>mạng</w:t>
-      </w:r>
-      <w:proofErr w:type="spellEnd"/>
-      <w:r>
-        <w:t xml:space="preserve"> </w:t>
-      </w:r>
-      <w:proofErr w:type="spellStart"/>
-      <w:r>
-        <w:t>trong</w:t>
-      </w:r>
-      <w:proofErr w:type="spellEnd"/>
-      <w:r>
-        <w:t xml:space="preserve"> </w:t>
-      </w:r>
-      <w:proofErr w:type="spellStart"/>
-      <w:r>
-        <w:t>hoạt</w:t>
-      </w:r>
-      <w:proofErr w:type="spellEnd"/>
-      <w:r>
-        <w:t xml:space="preserve"> </w:t>
-      </w:r>
-      <w:proofErr w:type="spellStart"/>
-      <w:r>
-        <w:t>động</w:t>
-      </w:r>
-      <w:proofErr w:type="spellEnd"/>
-      <w:r>
-        <w:t xml:space="preserve"> </w:t>
-      </w:r>
-      <w:proofErr w:type="spellStart"/>
-      <w:r>
-        <w:t>của</w:t>
-      </w:r>
-      <w:proofErr w:type="spellEnd"/>
-      <w:r>
-        <w:t xml:space="preserve"> </w:t>
-      </w:r>
-      <w:proofErr w:type="spellStart"/>
-      <w:r>
-        <w:t>cơ</w:t>
-      </w:r>
-      <w:proofErr w:type="spellEnd"/>
-      <w:r>
-        <w:t xml:space="preserve"> </w:t>
-      </w:r>
-      <w:proofErr w:type="spellStart"/>
-      <w:r>
-        <w:t>quan</w:t>
-      </w:r>
-      <w:proofErr w:type="spellEnd"/>
-      <w:r>
-        <w:t xml:space="preserve"> </w:t>
-      </w:r>
-      <w:proofErr w:type="spellStart"/>
-      <w:r>
-        <w:t>nhà</w:t>
-      </w:r>
-      <w:proofErr w:type="spellEnd"/>
-      <w:r>
-        <w:t xml:space="preserve"> </w:t>
-      </w:r>
-      <w:proofErr w:type="spellStart"/>
-      <w:r>
-        <w:t>nước</w:t>
-      </w:r>
-      <w:proofErr w:type="spellEnd"/>
-      <w:r>
-        <w:t xml:space="preserve"> </w:t>
-      </w:r>
-      <w:proofErr w:type="spellStart"/>
-      <w:r>
-        <w:t>Tỉnh</w:t>
-      </w:r>
-      <w:proofErr w:type="spellEnd"/>
-      <w:r>
-        <w:t xml:space="preserve"> Ninh Bình</w:t>
-      </w:r>
-      <w:r>
-        <w:t>;</w:t>
-      </w:r>
+        <w:t>- Căn cứ Quyết định số {{BC_qd_ubnd_tinh_so_attt}} của UBND Tỉnh {{BC_ten_tinh}} ban hành Quy chế bảo đảm an toàn thông tin mạng trong hoạt động của cơ quan nhà nước Tỉnh {{BC_ten_tinh}};</w:t>
+      </w:r>
+      <w:proofErr w:type="spellStart"/>
+      <w:r/>
+      <w:proofErr w:type="spellEnd"/>
+      <w:r/>
+      <w:proofErr w:type="spellStart"/>
+      <w:r/>
+      <w:proofErr w:type="spellEnd"/>
+      <w:r/>
+      <w:proofErr w:type="spellStart"/>
+      <w:r/>
+      <w:proofErr w:type="spellEnd"/>
+      <w:r/>
+      <w:proofErr w:type="spellStart"/>
+      <w:r/>
+      <w:proofErr w:type="spellEnd"/>
+      <w:r/>
+      <w:proofErr w:type="spellStart"/>
+      <w:r/>
+      <w:proofErr w:type="spellEnd"/>
+      <w:r/>
+      <w:proofErr w:type="spellStart"/>
+      <w:r/>
+      <w:proofErr w:type="spellEnd"/>
+      <w:r/>
+      <w:proofErr w:type="spellStart"/>
+      <w:r/>
+      <w:proofErr w:type="spellEnd"/>
+      <w:r/>
+      <w:proofErr w:type="spellStart"/>
+      <w:r/>
+      <w:proofErr w:type="spellEnd"/>
+      <w:r/>
+      <w:r/>
+      <w:proofErr w:type="spellStart"/>
+      <w:r/>
+      <w:proofErr w:type="spellEnd"/>
+      <w:r/>
+      <w:proofErr w:type="spellStart"/>
+      <w:r/>
+      <w:proofErr w:type="spellEnd"/>
+      <w:r/>
+      <w:proofErr w:type="spellStart"/>
+      <w:r/>
+      <w:proofErr w:type="spellEnd"/>
+      <w:r/>
+      <w:proofErr w:type="spellStart"/>
+      <w:r/>
+      <w:proofErr w:type="spellEnd"/>
+      <w:r/>
+      <w:proofErr w:type="spellStart"/>
+      <w:r/>
+      <w:proofErr w:type="spellEnd"/>
+      <w:r/>
+      <w:proofErr w:type="spellStart"/>
+      <w:r/>
+      <w:proofErr w:type="spellEnd"/>
+      <w:r/>
+      <w:proofErr w:type="spellStart"/>
+      <w:r/>
+      <w:proofErr w:type="spellEnd"/>
+      <w:r/>
+      <w:proofErr w:type="spellStart"/>
+      <w:r/>
+      <w:proofErr w:type="spellEnd"/>
+      <w:r/>
+      <w:proofErr w:type="spellStart"/>
+      <w:r/>
+      <w:proofErr w:type="spellEnd"/>
+      <w:r/>
+      <w:proofErr w:type="spellStart"/>
+      <w:r/>
+      <w:proofErr w:type="spellEnd"/>
+      <w:r/>
+      <w:proofErr w:type="spellStart"/>
+      <w:r/>
+      <w:proofErr w:type="spellEnd"/>
+      <w:r/>
+      <w:proofErr w:type="spellStart"/>
+      <w:r/>
+      <w:proofErr w:type="spellEnd"/>
+      <w:r/>
+      <w:proofErr w:type="spellStart"/>
+      <w:r/>
+      <w:proofErr w:type="spellEnd"/>
+      <w:r/>
+      <w:proofErr w:type="spellStart"/>
+      <w:r/>
+      <w:proofErr w:type="spellEnd"/>
+      <w:r/>
+      <w:proofErr w:type="spellStart"/>
+      <w:r/>
+      <w:proofErr w:type="spellEnd"/>
+      <w:r/>
+      <w:proofErr w:type="spellStart"/>
+      <w:r/>
+      <w:proofErr w:type="spellEnd"/>
+      <w:r/>
+      <w:r/>
     </w:p>
     <w:p>
       <w:pPr>
@@ -2133,182 +1711,94 @@
         <w:jc w:val="both"/>
       </w:pPr>
       <w:r>
-        <w:t xml:space="preserve">- </w:t>
-      </w:r>
-      <w:proofErr w:type="spellStart"/>
-      <w:r>
-        <w:t>Căn</w:t>
-      </w:r>
-      <w:proofErr w:type="spellEnd"/>
-      <w:r>
-        <w:t xml:space="preserve"> </w:t>
-      </w:r>
-      <w:proofErr w:type="spellStart"/>
-      <w:r>
-        <w:t>cứ</w:t>
-      </w:r>
-      <w:proofErr w:type="spellEnd"/>
-      <w:r>
-        <w:t xml:space="preserve"> </w:t>
-      </w:r>
-      <w:proofErr w:type="spellStart"/>
-      <w:r>
-        <w:t>Quyết</w:t>
-      </w:r>
-      <w:proofErr w:type="spellEnd"/>
-      <w:r>
-        <w:t xml:space="preserve"> </w:t>
-      </w:r>
-      <w:proofErr w:type="spellStart"/>
-      <w:r>
-        <w:t>định</w:t>
-      </w:r>
-      <w:proofErr w:type="spellEnd"/>
-      <w:r>
-        <w:t xml:space="preserve"> </w:t>
-      </w:r>
-      <w:proofErr w:type="spellStart"/>
-      <w:r>
-        <w:t>số</w:t>
-      </w:r>
-      <w:proofErr w:type="spellEnd"/>
-      <w:r>
-        <w:t xml:space="preserve"> 3614/QĐ-UBND </w:t>
-      </w:r>
-      <w:proofErr w:type="spellStart"/>
-      <w:r>
-        <w:t>ngày</w:t>
-      </w:r>
-      <w:proofErr w:type="spellEnd"/>
-      <w:r>
-        <w:t xml:space="preserve"> 01/7/2025 </w:t>
-      </w:r>
-      <w:proofErr w:type="spellStart"/>
-      <w:r>
-        <w:t>của</w:t>
-      </w:r>
-      <w:proofErr w:type="spellEnd"/>
-      <w:r>
-        <w:t xml:space="preserve"> UBND </w:t>
-      </w:r>
-      <w:proofErr w:type="spellStart"/>
-      <w:r>
-        <w:t>Tỉnh</w:t>
-      </w:r>
-      <w:proofErr w:type="spellEnd"/>
-      <w:r>
-        <w:t xml:space="preserve"> Ninh Bình</w:t>
-      </w:r>
-      <w:r>
-        <w:t xml:space="preserve"> </w:t>
-      </w:r>
-      <w:proofErr w:type="spellStart"/>
-      <w:r>
-        <w:t>về</w:t>
-      </w:r>
-      <w:proofErr w:type="spellEnd"/>
-      <w:r>
-        <w:t xml:space="preserve"> </w:t>
-      </w:r>
-      <w:proofErr w:type="spellStart"/>
-      <w:r>
-        <w:t>việc</w:t>
-      </w:r>
-      <w:proofErr w:type="spellEnd"/>
-      <w:r>
-        <w:t xml:space="preserve"> </w:t>
-      </w:r>
-      <w:proofErr w:type="spellStart"/>
-      <w:r>
-        <w:t>phân</w:t>
-      </w:r>
-      <w:proofErr w:type="spellEnd"/>
-      <w:r>
-        <w:t xml:space="preserve"> </w:t>
-      </w:r>
-      <w:proofErr w:type="spellStart"/>
-      <w:r>
-        <w:t>công</w:t>
-      </w:r>
-      <w:proofErr w:type="spellEnd"/>
-      <w:r>
-        <w:t xml:space="preserve"> </w:t>
-      </w:r>
-      <w:proofErr w:type="spellStart"/>
-      <w:r>
-        <w:t>đơn</w:t>
-      </w:r>
-      <w:proofErr w:type="spellEnd"/>
-      <w:r>
-        <w:t xml:space="preserve"> </w:t>
-      </w:r>
-      <w:proofErr w:type="spellStart"/>
-      <w:r>
-        <w:t>vị</w:t>
-      </w:r>
-      <w:proofErr w:type="spellEnd"/>
-      <w:r>
-        <w:t xml:space="preserve"> </w:t>
-      </w:r>
-      <w:proofErr w:type="spellStart"/>
-      <w:r>
-        <w:t>chuyên</w:t>
-      </w:r>
-      <w:proofErr w:type="spellEnd"/>
-      <w:r>
-        <w:t xml:space="preserve"> </w:t>
-      </w:r>
-      <w:proofErr w:type="spellStart"/>
-      <w:r>
-        <w:t>trách</w:t>
-      </w:r>
-      <w:proofErr w:type="spellEnd"/>
-      <w:r>
-        <w:t xml:space="preserve"> an </w:t>
-      </w:r>
-      <w:proofErr w:type="spellStart"/>
-      <w:r>
-        <w:t>toàn</w:t>
-      </w:r>
-      <w:proofErr w:type="spellEnd"/>
-      <w:r>
-        <w:t xml:space="preserve"> </w:t>
-      </w:r>
-      <w:proofErr w:type="spellStart"/>
-      <w:r>
-        <w:t>thông</w:t>
-      </w:r>
-      <w:proofErr w:type="spellEnd"/>
-      <w:r>
-        <w:t xml:space="preserve"> tin </w:t>
-      </w:r>
-      <w:proofErr w:type="spellStart"/>
-      <w:r>
-        <w:t>mạng</w:t>
-      </w:r>
-      <w:proofErr w:type="spellEnd"/>
-      <w:r>
-        <w:t xml:space="preserve"> </w:t>
-      </w:r>
-      <w:proofErr w:type="spellStart"/>
-      <w:r>
-        <w:t>của</w:t>
-      </w:r>
-      <w:proofErr w:type="spellEnd"/>
-      <w:r>
-        <w:t xml:space="preserve"> UBND </w:t>
-      </w:r>
-      <w:proofErr w:type="spellStart"/>
-      <w:r>
-        <w:t>Tỉnh</w:t>
-      </w:r>
-      <w:proofErr w:type="spellEnd"/>
-      <w:r>
-        <w:t xml:space="preserve"> Ninh Bình</w:t>
-      </w:r>
-      <w:r>
-        <w:t>.</w:t>
-      </w:r>
+        <w:t>- Căn cứ Quyết định số {{BC_qd_ubnd_tinh_phan_cong}} của UBND Tỉnh {{BC_ten_tinh}} về việc phân công đơn vị chuyên trách an toàn thông tin mạng của UBND Tỉnh {{BC_ten_tinh}}.</w:t>
+      </w:r>
+      <w:proofErr w:type="spellStart"/>
+      <w:r/>
+      <w:proofErr w:type="spellEnd"/>
+      <w:r/>
+      <w:proofErr w:type="spellStart"/>
+      <w:r/>
+      <w:proofErr w:type="spellEnd"/>
+      <w:r/>
+      <w:proofErr w:type="spellStart"/>
+      <w:r/>
+      <w:proofErr w:type="spellEnd"/>
+      <w:r/>
+      <w:proofErr w:type="spellStart"/>
+      <w:r/>
+      <w:proofErr w:type="spellEnd"/>
+      <w:r/>
+      <w:proofErr w:type="spellStart"/>
+      <w:r/>
+      <w:proofErr w:type="spellEnd"/>
+      <w:r/>
+      <w:proofErr w:type="spellStart"/>
+      <w:r/>
+      <w:proofErr w:type="spellEnd"/>
+      <w:r/>
+      <w:proofErr w:type="spellStart"/>
+      <w:r/>
+      <w:proofErr w:type="spellEnd"/>
+      <w:r/>
+      <w:proofErr w:type="spellStart"/>
+      <w:r/>
+      <w:proofErr w:type="spellEnd"/>
+      <w:r/>
+      <w:r/>
+      <w:proofErr w:type="spellStart"/>
+      <w:r/>
+      <w:proofErr w:type="spellEnd"/>
+      <w:r/>
+      <w:proofErr w:type="spellStart"/>
+      <w:r/>
+      <w:proofErr w:type="spellEnd"/>
+      <w:r/>
+      <w:proofErr w:type="spellStart"/>
+      <w:r/>
+      <w:proofErr w:type="spellEnd"/>
+      <w:r/>
+      <w:proofErr w:type="spellStart"/>
+      <w:r/>
+      <w:proofErr w:type="spellEnd"/>
+      <w:r/>
+      <w:proofErr w:type="spellStart"/>
+      <w:r/>
+      <w:proofErr w:type="spellEnd"/>
+      <w:r/>
+      <w:proofErr w:type="spellStart"/>
+      <w:r/>
+      <w:proofErr w:type="spellEnd"/>
+      <w:r/>
+      <w:proofErr w:type="spellStart"/>
+      <w:r/>
+      <w:proofErr w:type="spellEnd"/>
+      <w:r/>
+      <w:proofErr w:type="spellStart"/>
+      <w:r/>
+      <w:proofErr w:type="spellEnd"/>
+      <w:r/>
+      <w:proofErr w:type="spellStart"/>
+      <w:r/>
+      <w:proofErr w:type="spellEnd"/>
+      <w:r/>
+      <w:proofErr w:type="spellStart"/>
+      <w:r/>
+      <w:proofErr w:type="spellEnd"/>
+      <w:r/>
+      <w:proofErr w:type="spellStart"/>
+      <w:r/>
+      <w:proofErr w:type="spellEnd"/>
+      <w:r/>
+      <w:proofErr w:type="spellStart"/>
+      <w:r/>
+      <w:proofErr w:type="spellEnd"/>
+      <w:r/>
+      <w:proofErr w:type="spellStart"/>
+      <w:r/>
+      <w:proofErr w:type="spellEnd"/>
+      <w:r/>
+      <w:r/>
     </w:p>
     <w:p>
       <w:pPr>
@@ -4883,259 +4373,133 @@
         <w:jc w:val="both"/>
       </w:pPr>
       <w:r>
-        <w:t xml:space="preserve">Phạm vi </w:t>
-      </w:r>
-      <w:proofErr w:type="spellStart"/>
-      <w:r>
-        <w:t>khảo</w:t>
-      </w:r>
-      <w:proofErr w:type="spellEnd"/>
-      <w:r>
-        <w:t xml:space="preserve"> </w:t>
-      </w:r>
-      <w:proofErr w:type="spellStart"/>
-      <w:r>
-        <w:t>sát</w:t>
-      </w:r>
-      <w:proofErr w:type="spellEnd"/>
-      <w:r>
-        <w:t xml:space="preserve"> </w:t>
-      </w:r>
-      <w:proofErr w:type="spellStart"/>
-      <w:r>
-        <w:t>phục</w:t>
-      </w:r>
-      <w:proofErr w:type="spellEnd"/>
-      <w:r>
-        <w:t xml:space="preserve"> </w:t>
-      </w:r>
-      <w:proofErr w:type="spellStart"/>
-      <w:r>
-        <w:t>vụ</w:t>
-      </w:r>
-      <w:proofErr w:type="spellEnd"/>
-      <w:r>
-        <w:t xml:space="preserve"> </w:t>
-      </w:r>
-      <w:proofErr w:type="spellStart"/>
-      <w:r>
-        <w:t>việc</w:t>
-      </w:r>
-      <w:proofErr w:type="spellEnd"/>
-      <w:r>
-        <w:t xml:space="preserve"> </w:t>
-      </w:r>
-      <w:proofErr w:type="spellStart"/>
-      <w:r>
-        <w:t>lập</w:t>
-      </w:r>
-      <w:proofErr w:type="spellEnd"/>
-      <w:r>
-        <w:t xml:space="preserve"> </w:t>
-      </w:r>
-      <w:proofErr w:type="spellStart"/>
-      <w:r>
-        <w:t>hồ</w:t>
-      </w:r>
-      <w:proofErr w:type="spellEnd"/>
-      <w:r>
-        <w:t xml:space="preserve"> </w:t>
-      </w:r>
-      <w:proofErr w:type="spellStart"/>
-      <w:r>
-        <w:t>sơ</w:t>
-      </w:r>
-      <w:proofErr w:type="spellEnd"/>
-      <w:r>
-        <w:t xml:space="preserve"> </w:t>
-      </w:r>
-      <w:proofErr w:type="spellStart"/>
-      <w:r>
-        <w:t>xác</w:t>
-      </w:r>
-      <w:proofErr w:type="spellEnd"/>
-      <w:r>
-        <w:t xml:space="preserve"> </w:t>
-      </w:r>
-      <w:proofErr w:type="spellStart"/>
-      <w:r>
-        <w:t>định</w:t>
-      </w:r>
-      <w:proofErr w:type="spellEnd"/>
-      <w:r>
-        <w:t xml:space="preserve"> </w:t>
-      </w:r>
-      <w:proofErr w:type="spellStart"/>
-      <w:r>
-        <w:t>cấp</w:t>
-      </w:r>
-      <w:proofErr w:type="spellEnd"/>
-      <w:r>
-        <w:t xml:space="preserve"> </w:t>
-      </w:r>
-      <w:proofErr w:type="spellStart"/>
-      <w:r>
-        <w:t>độ</w:t>
-      </w:r>
-      <w:proofErr w:type="spellEnd"/>
-      <w:r>
-        <w:t xml:space="preserve"> an </w:t>
-      </w:r>
-      <w:proofErr w:type="spellStart"/>
-      <w:r>
-        <w:t>toàn</w:t>
-      </w:r>
-      <w:proofErr w:type="spellEnd"/>
-      <w:r>
-        <w:t xml:space="preserve"> </w:t>
-      </w:r>
-      <w:proofErr w:type="spellStart"/>
-      <w:r>
-        <w:t>thông</w:t>
-      </w:r>
-      <w:proofErr w:type="spellEnd"/>
-      <w:r>
-        <w:t xml:space="preserve"> tin </w:t>
-      </w:r>
-      <w:proofErr w:type="spellStart"/>
-      <w:r>
-        <w:t>đối</w:t>
-      </w:r>
-      <w:proofErr w:type="spellEnd"/>
-      <w:r>
-        <w:t xml:space="preserve"> </w:t>
-      </w:r>
-      <w:proofErr w:type="spellStart"/>
-      <w:r>
-        <w:t>với</w:t>
-      </w:r>
-      <w:proofErr w:type="spellEnd"/>
-      <w:r>
-        <w:t xml:space="preserve"> </w:t>
-      </w:r>
-      <w:proofErr w:type="spellStart"/>
-      <w:r>
-        <w:t>hệ</w:t>
-      </w:r>
-      <w:proofErr w:type="spellEnd"/>
-      <w:r>
-        <w:t xml:space="preserve"> </w:t>
-      </w:r>
-      <w:proofErr w:type="spellStart"/>
-      <w:r>
-        <w:t>thống</w:t>
-      </w:r>
-      <w:proofErr w:type="spellEnd"/>
-      <w:r>
-        <w:t xml:space="preserve"> </w:t>
-      </w:r>
-      <w:proofErr w:type="spellStart"/>
-      <w:r>
-        <w:t>thông</w:t>
-      </w:r>
-      <w:proofErr w:type="spellEnd"/>
-      <w:r>
-        <w:t xml:space="preserve"> tin </w:t>
-      </w:r>
-      <w:proofErr w:type="spellStart"/>
-      <w:r>
-        <w:t>của</w:t>
-      </w:r>
-      <w:proofErr w:type="spellEnd"/>
-      <w:r>
-        <w:t xml:space="preserve"> </w:t>
-      </w:r>
-      <w:proofErr w:type="spellStart"/>
-      <w:r>
-        <w:t>Ủy</w:t>
-      </w:r>
-      <w:proofErr w:type="spellEnd"/>
-      <w:r>
-        <w:t xml:space="preserve"> ban </w:t>
-      </w:r>
-      <w:proofErr w:type="spellStart"/>
-      <w:r>
-        <w:t>nhân</w:t>
-      </w:r>
-      <w:proofErr w:type="spellEnd"/>
-      <w:r>
-        <w:t xml:space="preserve"> </w:t>
-      </w:r>
-      <w:proofErr w:type="spellStart"/>
-      <w:r>
-        <w:t>dân</w:t>
-      </w:r>
-      <w:proofErr w:type="spellEnd"/>
-      <w:r>
-        <w:t xml:space="preserve"> </w:t>
-      </w:r>
-      <w:proofErr w:type="spellStart"/>
-      <w:r>
-        <w:t>xã</w:t>
-      </w:r>
-      <w:proofErr w:type="spellEnd"/>
-      <w:r>
-        <w:t xml:space="preserve"> </w:t>
-      </w:r>
-      <w:proofErr w:type="spellStart"/>
-      <w:r>
-        <w:t>Lý</w:t>
-      </w:r>
-      <w:proofErr w:type="spellEnd"/>
-      <w:r>
-        <w:t xml:space="preserve"> </w:t>
-      </w:r>
-      <w:proofErr w:type="spellStart"/>
-      <w:r>
-        <w:t>Nhân</w:t>
-      </w:r>
-      <w:proofErr w:type="spellEnd"/>
-      <w:r>
-        <w:t xml:space="preserve"> (UBND </w:t>
-      </w:r>
-      <w:proofErr w:type="spellStart"/>
-      <w:r>
-        <w:t>xã</w:t>
-      </w:r>
-      <w:proofErr w:type="spellEnd"/>
-      <w:r>
-        <w:t xml:space="preserve"> </w:t>
-      </w:r>
-      <w:proofErr w:type="spellStart"/>
-      <w:r>
-        <w:t>Lý</w:t>
-      </w:r>
-      <w:proofErr w:type="spellEnd"/>
-      <w:r>
-        <w:t xml:space="preserve"> </w:t>
-      </w:r>
-      <w:proofErr w:type="spellStart"/>
-      <w:r>
-        <w:t>Nhân</w:t>
-      </w:r>
-      <w:proofErr w:type="spellEnd"/>
-      <w:r>
-        <w:t xml:space="preserve">), </w:t>
-      </w:r>
-      <w:proofErr w:type="spellStart"/>
-      <w:r>
-        <w:t>Tỉnh</w:t>
-      </w:r>
-      <w:proofErr w:type="spellEnd"/>
-      <w:r>
-        <w:t xml:space="preserve"> Ninh Bình</w:t>
-      </w:r>
-      <w:r>
-        <w:t xml:space="preserve">, bao </w:t>
-      </w:r>
-      <w:proofErr w:type="spellStart"/>
-      <w:r>
-        <w:t>gồm</w:t>
-      </w:r>
-      <w:proofErr w:type="spellEnd"/>
-      <w:r>
-        <w:t>:</w:t>
-      </w:r>
+        <w:t>Phạm vi khảo sát phục vụ việc lập hồ sơ xác định cấp độ an toàn thông tin đối với hệ thống thông tin của {{ten_don_vi}} ({{ten_don_vi}}), Tỉnh {{BC_ten_tinh}}, bao gồm:</w:t>
+      </w:r>
+      <w:proofErr w:type="spellStart"/>
+      <w:r/>
+      <w:proofErr w:type="spellEnd"/>
+      <w:r/>
+      <w:proofErr w:type="spellStart"/>
+      <w:r/>
+      <w:proofErr w:type="spellEnd"/>
+      <w:r/>
+      <w:proofErr w:type="spellStart"/>
+      <w:r/>
+      <w:proofErr w:type="spellEnd"/>
+      <w:r/>
+      <w:proofErr w:type="spellStart"/>
+      <w:r/>
+      <w:proofErr w:type="spellEnd"/>
+      <w:r/>
+      <w:proofErr w:type="spellStart"/>
+      <w:r/>
+      <w:proofErr w:type="spellEnd"/>
+      <w:r/>
+      <w:proofErr w:type="spellStart"/>
+      <w:r/>
+      <w:proofErr w:type="spellEnd"/>
+      <w:r/>
+      <w:proofErr w:type="spellStart"/>
+      <w:r/>
+      <w:proofErr w:type="spellEnd"/>
+      <w:r/>
+      <w:proofErr w:type="spellStart"/>
+      <w:r/>
+      <w:proofErr w:type="spellEnd"/>
+      <w:r/>
+      <w:proofErr w:type="spellStart"/>
+      <w:r/>
+      <w:proofErr w:type="spellEnd"/>
+      <w:r/>
+      <w:proofErr w:type="spellStart"/>
+      <w:r/>
+      <w:proofErr w:type="spellEnd"/>
+      <w:r/>
+      <w:proofErr w:type="spellStart"/>
+      <w:r/>
+      <w:proofErr w:type="spellEnd"/>
+      <w:r/>
+      <w:proofErr w:type="spellStart"/>
+      <w:r/>
+      <w:proofErr w:type="spellEnd"/>
+      <w:r/>
+      <w:proofErr w:type="spellStart"/>
+      <w:r/>
+      <w:proofErr w:type="spellEnd"/>
+      <w:r/>
+      <w:proofErr w:type="spellStart"/>
+      <w:r/>
+      <w:proofErr w:type="spellEnd"/>
+      <w:r/>
+      <w:proofErr w:type="spellStart"/>
+      <w:r/>
+      <w:proofErr w:type="spellEnd"/>
+      <w:r/>
+      <w:proofErr w:type="spellStart"/>
+      <w:r/>
+      <w:proofErr w:type="spellEnd"/>
+      <w:r/>
+      <w:proofErr w:type="spellStart"/>
+      <w:r/>
+      <w:proofErr w:type="spellEnd"/>
+      <w:r/>
+      <w:proofErr w:type="spellStart"/>
+      <w:r/>
+      <w:proofErr w:type="spellEnd"/>
+      <w:r/>
+      <w:proofErr w:type="spellStart"/>
+      <w:r/>
+      <w:proofErr w:type="spellEnd"/>
+      <w:r/>
+      <w:proofErr w:type="spellStart"/>
+      <w:r/>
+      <w:proofErr w:type="spellEnd"/>
+      <w:r/>
+      <w:proofErr w:type="spellStart"/>
+      <w:r/>
+      <w:proofErr w:type="spellEnd"/>
+      <w:r/>
+      <w:proofErr w:type="spellStart"/>
+      <w:r/>
+      <w:proofErr w:type="spellEnd"/>
+      <w:r/>
+      <w:proofErr w:type="spellStart"/>
+      <w:r/>
+      <w:proofErr w:type="spellEnd"/>
+      <w:r/>
+      <w:proofErr w:type="spellStart"/>
+      <w:r/>
+      <w:proofErr w:type="spellEnd"/>
+      <w:r/>
+      <w:proofErr w:type="spellStart"/>
+      <w:r/>
+      <w:proofErr w:type="spellEnd"/>
+      <w:r/>
+      <w:proofErr w:type="spellStart"/>
+      <w:r/>
+      <w:proofErr w:type="spellEnd"/>
+      <w:r/>
+      <w:proofErr w:type="spellStart"/>
+      <w:r/>
+      <w:proofErr w:type="spellEnd"/>
+      <w:r/>
+      <w:proofErr w:type="spellStart"/>
+      <w:r/>
+      <w:proofErr w:type="spellEnd"/>
+      <w:r/>
+      <w:proofErr w:type="spellStart"/>
+      <w:r/>
+      <w:proofErr w:type="spellEnd"/>
+      <w:r/>
+      <w:proofErr w:type="spellStart"/>
+      <w:r/>
+      <w:proofErr w:type="spellEnd"/>
+      <w:r/>
+      <w:r/>
+      <w:proofErr w:type="spellStart"/>
+      <w:r/>
+      <w:proofErr w:type="spellEnd"/>
+      <w:r/>
     </w:p>
     <w:p>
       <w:pPr>
@@ -5143,184 +4507,96 @@
         <w:jc w:val="both"/>
       </w:pPr>
       <w:r>
-        <w:t xml:space="preserve">+ </w:t>
-      </w:r>
-      <w:proofErr w:type="spellStart"/>
-      <w:r>
-        <w:t>Hệ</w:t>
-      </w:r>
-      <w:proofErr w:type="spellEnd"/>
-      <w:r>
-        <w:t xml:space="preserve"> </w:t>
-      </w:r>
-      <w:proofErr w:type="spellStart"/>
-      <w:r>
-        <w:t>thống</w:t>
-      </w:r>
-      <w:proofErr w:type="spellEnd"/>
-      <w:r>
-        <w:t xml:space="preserve"> </w:t>
-      </w:r>
-      <w:proofErr w:type="spellStart"/>
-      <w:r>
-        <w:t>thông</w:t>
-      </w:r>
-      <w:proofErr w:type="spellEnd"/>
-      <w:r>
-        <w:t xml:space="preserve"> tin </w:t>
-      </w:r>
-      <w:proofErr w:type="spellStart"/>
-      <w:r>
-        <w:t>phục</w:t>
-      </w:r>
-      <w:proofErr w:type="spellEnd"/>
-      <w:r>
-        <w:t xml:space="preserve"> </w:t>
-      </w:r>
-      <w:proofErr w:type="spellStart"/>
-      <w:r>
-        <w:t>vụ</w:t>
-      </w:r>
-      <w:proofErr w:type="spellEnd"/>
-      <w:r>
-        <w:t xml:space="preserve"> </w:t>
-      </w:r>
-      <w:proofErr w:type="spellStart"/>
-      <w:r>
-        <w:t>công</w:t>
-      </w:r>
-      <w:proofErr w:type="spellEnd"/>
-      <w:r>
-        <w:t xml:space="preserve"> </w:t>
-      </w:r>
-      <w:proofErr w:type="spellStart"/>
-      <w:r>
-        <w:t>tác</w:t>
-      </w:r>
-      <w:proofErr w:type="spellEnd"/>
-      <w:r>
-        <w:t xml:space="preserve"> </w:t>
-      </w:r>
-      <w:proofErr w:type="spellStart"/>
-      <w:r>
-        <w:t>quản</w:t>
-      </w:r>
-      <w:proofErr w:type="spellEnd"/>
-      <w:r>
-        <w:t xml:space="preserve"> </w:t>
-      </w:r>
-      <w:proofErr w:type="spellStart"/>
-      <w:r>
-        <w:t>lý</w:t>
-      </w:r>
-      <w:proofErr w:type="spellEnd"/>
-      <w:r>
-        <w:t xml:space="preserve">, </w:t>
-      </w:r>
-      <w:proofErr w:type="spellStart"/>
-      <w:r>
-        <w:t>điều</w:t>
-      </w:r>
-      <w:proofErr w:type="spellEnd"/>
-      <w:r>
-        <w:t xml:space="preserve"> </w:t>
-      </w:r>
-      <w:proofErr w:type="spellStart"/>
-      <w:r>
-        <w:t>hành</w:t>
-      </w:r>
-      <w:proofErr w:type="spellEnd"/>
-      <w:r>
-        <w:t xml:space="preserve"> </w:t>
-      </w:r>
-      <w:proofErr w:type="spellStart"/>
-      <w:r>
-        <w:t>và</w:t>
-      </w:r>
-      <w:proofErr w:type="spellEnd"/>
-      <w:r>
-        <w:t xml:space="preserve"> </w:t>
-      </w:r>
-      <w:proofErr w:type="spellStart"/>
-      <w:r>
-        <w:t>giải</w:t>
-      </w:r>
-      <w:proofErr w:type="spellEnd"/>
-      <w:r>
-        <w:t xml:space="preserve"> </w:t>
-      </w:r>
-      <w:proofErr w:type="spellStart"/>
-      <w:r>
-        <w:t>quyết</w:t>
-      </w:r>
-      <w:proofErr w:type="spellEnd"/>
-      <w:r>
-        <w:t xml:space="preserve"> </w:t>
-      </w:r>
-      <w:proofErr w:type="spellStart"/>
-      <w:r>
-        <w:t>thủ</w:t>
-      </w:r>
-      <w:proofErr w:type="spellEnd"/>
-      <w:r>
-        <w:t xml:space="preserve"> </w:t>
-      </w:r>
-      <w:proofErr w:type="spellStart"/>
-      <w:r>
-        <w:t>tục</w:t>
-      </w:r>
-      <w:proofErr w:type="spellEnd"/>
-      <w:r>
-        <w:t xml:space="preserve"> </w:t>
-      </w:r>
-      <w:proofErr w:type="spellStart"/>
-      <w:r>
-        <w:t>hành</w:t>
-      </w:r>
-      <w:proofErr w:type="spellEnd"/>
-      <w:r>
-        <w:t xml:space="preserve"> </w:t>
-      </w:r>
-      <w:proofErr w:type="spellStart"/>
-      <w:r>
-        <w:t>chính</w:t>
-      </w:r>
-      <w:proofErr w:type="spellEnd"/>
-      <w:r>
-        <w:t xml:space="preserve"> </w:t>
-      </w:r>
-      <w:proofErr w:type="spellStart"/>
-      <w:r>
-        <w:t>tại</w:t>
-      </w:r>
-      <w:proofErr w:type="spellEnd"/>
-      <w:r>
-        <w:t xml:space="preserve"> UBND </w:t>
-      </w:r>
-      <w:proofErr w:type="spellStart"/>
-      <w:r>
-        <w:t>xã</w:t>
-      </w:r>
-      <w:proofErr w:type="spellEnd"/>
-      <w:r>
-        <w:t xml:space="preserve"> </w:t>
-      </w:r>
-      <w:proofErr w:type="spellStart"/>
-      <w:r>
-        <w:t>Lý</w:t>
-      </w:r>
-      <w:proofErr w:type="spellEnd"/>
-      <w:r>
-        <w:t xml:space="preserve"> </w:t>
-      </w:r>
-      <w:proofErr w:type="spellStart"/>
-      <w:r>
-        <w:t>Nhân</w:t>
-      </w:r>
-      <w:proofErr w:type="spellEnd"/>
-      <w:r>
-        <w:t>.</w:t>
-      </w:r>
+        <w:t>+ Hệ thống thông tin phục vụ công tác quản lý, điều hành và giải quyết thủ tục hành chính tại {{ten_don_vi}}.</w:t>
+      </w:r>
+      <w:proofErr w:type="spellStart"/>
+      <w:r/>
+      <w:proofErr w:type="spellEnd"/>
+      <w:r/>
+      <w:proofErr w:type="spellStart"/>
+      <w:r/>
+      <w:proofErr w:type="spellEnd"/>
+      <w:r/>
+      <w:proofErr w:type="spellStart"/>
+      <w:r/>
+      <w:proofErr w:type="spellEnd"/>
+      <w:r/>
+      <w:proofErr w:type="spellStart"/>
+      <w:r/>
+      <w:proofErr w:type="spellEnd"/>
+      <w:r/>
+      <w:proofErr w:type="spellStart"/>
+      <w:r/>
+      <w:proofErr w:type="spellEnd"/>
+      <w:r/>
+      <w:proofErr w:type="spellStart"/>
+      <w:r/>
+      <w:proofErr w:type="spellEnd"/>
+      <w:r/>
+      <w:proofErr w:type="spellStart"/>
+      <w:r/>
+      <w:proofErr w:type="spellEnd"/>
+      <w:r/>
+      <w:proofErr w:type="spellStart"/>
+      <w:r/>
+      <w:proofErr w:type="spellEnd"/>
+      <w:r/>
+      <w:proofErr w:type="spellStart"/>
+      <w:r/>
+      <w:proofErr w:type="spellEnd"/>
+      <w:r/>
+      <w:proofErr w:type="spellStart"/>
+      <w:r/>
+      <w:proofErr w:type="spellEnd"/>
+      <w:r/>
+      <w:proofErr w:type="spellStart"/>
+      <w:r/>
+      <w:proofErr w:type="spellEnd"/>
+      <w:r/>
+      <w:proofErr w:type="spellStart"/>
+      <w:r/>
+      <w:proofErr w:type="spellEnd"/>
+      <w:r/>
+      <w:proofErr w:type="spellStart"/>
+      <w:r/>
+      <w:proofErr w:type="spellEnd"/>
+      <w:r/>
+      <w:proofErr w:type="spellStart"/>
+      <w:r/>
+      <w:proofErr w:type="spellEnd"/>
+      <w:r/>
+      <w:proofErr w:type="spellStart"/>
+      <w:r/>
+      <w:proofErr w:type="spellEnd"/>
+      <w:r/>
+      <w:proofErr w:type="spellStart"/>
+      <w:r/>
+      <w:proofErr w:type="spellEnd"/>
+      <w:r/>
+      <w:proofErr w:type="spellStart"/>
+      <w:r/>
+      <w:proofErr w:type="spellEnd"/>
+      <w:r/>
+      <w:proofErr w:type="spellStart"/>
+      <w:r/>
+      <w:proofErr w:type="spellEnd"/>
+      <w:r/>
+      <w:proofErr w:type="spellStart"/>
+      <w:r/>
+      <w:proofErr w:type="spellEnd"/>
+      <w:r/>
+      <w:proofErr w:type="spellStart"/>
+      <w:r/>
+      <w:proofErr w:type="spellEnd"/>
+      <w:r/>
+      <w:proofErr w:type="spellStart"/>
+      <w:r/>
+      <w:proofErr w:type="spellEnd"/>
+      <w:r/>
+      <w:proofErr w:type="spellStart"/>
+      <w:r/>
+      <w:proofErr w:type="spellEnd"/>
+      <w:r/>
     </w:p>
     <w:p>
       <w:pPr>
@@ -6339,491 +5615,249 @@
         <w:jc w:val="both"/>
       </w:pPr>
       <w:r>
-        <w:t xml:space="preserve">Phạm vi </w:t>
-      </w:r>
-      <w:proofErr w:type="spellStart"/>
-      <w:r>
-        <w:t>và</w:t>
-      </w:r>
-      <w:proofErr w:type="spellEnd"/>
-      <w:r>
-        <w:t xml:space="preserve"> </w:t>
-      </w:r>
-      <w:proofErr w:type="spellStart"/>
-      <w:r>
-        <w:t>đối</w:t>
-      </w:r>
-      <w:proofErr w:type="spellEnd"/>
-      <w:r>
-        <w:t xml:space="preserve"> </w:t>
-      </w:r>
-      <w:proofErr w:type="spellStart"/>
-      <w:r>
-        <w:t>tượng</w:t>
-      </w:r>
-      <w:proofErr w:type="spellEnd"/>
-      <w:r>
-        <w:t xml:space="preserve"> </w:t>
-      </w:r>
-      <w:proofErr w:type="spellStart"/>
-      <w:r>
-        <w:t>khảo</w:t>
-      </w:r>
-      <w:proofErr w:type="spellEnd"/>
-      <w:r>
-        <w:t xml:space="preserve"> </w:t>
-      </w:r>
-      <w:proofErr w:type="spellStart"/>
-      <w:r>
-        <w:t>sát</w:t>
-      </w:r>
-      <w:proofErr w:type="spellEnd"/>
-      <w:r>
-        <w:t xml:space="preserve"> </w:t>
-      </w:r>
-      <w:proofErr w:type="spellStart"/>
-      <w:r>
-        <w:t>nêu</w:t>
-      </w:r>
-      <w:proofErr w:type="spellEnd"/>
-      <w:r>
-        <w:t xml:space="preserve"> </w:t>
-      </w:r>
-      <w:proofErr w:type="spellStart"/>
-      <w:r>
-        <w:t>trên</w:t>
-      </w:r>
-      <w:proofErr w:type="spellEnd"/>
-      <w:r>
-        <w:t xml:space="preserve"> </w:t>
-      </w:r>
-      <w:proofErr w:type="spellStart"/>
-      <w:r>
-        <w:t>làm</w:t>
-      </w:r>
-      <w:proofErr w:type="spellEnd"/>
-      <w:r>
-        <w:t xml:space="preserve"> </w:t>
-      </w:r>
-      <w:proofErr w:type="spellStart"/>
-      <w:r>
-        <w:t>căn</w:t>
-      </w:r>
-      <w:proofErr w:type="spellEnd"/>
-      <w:r>
-        <w:t xml:space="preserve"> </w:t>
-      </w:r>
-      <w:proofErr w:type="spellStart"/>
-      <w:r>
-        <w:t>cứ</w:t>
-      </w:r>
-      <w:proofErr w:type="spellEnd"/>
-      <w:r>
-        <w:t xml:space="preserve"> </w:t>
-      </w:r>
-      <w:proofErr w:type="spellStart"/>
-      <w:r>
-        <w:t>để</w:t>
-      </w:r>
-      <w:proofErr w:type="spellEnd"/>
-      <w:r>
-        <w:t xml:space="preserve"> </w:t>
-      </w:r>
-      <w:proofErr w:type="spellStart"/>
-      <w:r>
-        <w:t>đánh</w:t>
-      </w:r>
-      <w:proofErr w:type="spellEnd"/>
-      <w:r>
-        <w:t xml:space="preserve"> </w:t>
-      </w:r>
-      <w:proofErr w:type="spellStart"/>
-      <w:r>
-        <w:t>giá</w:t>
-      </w:r>
-      <w:proofErr w:type="spellEnd"/>
-      <w:r>
-        <w:t xml:space="preserve"> </w:t>
-      </w:r>
-      <w:proofErr w:type="spellStart"/>
-      <w:r>
-        <w:t>hiện</w:t>
-      </w:r>
-      <w:proofErr w:type="spellEnd"/>
-      <w:r>
-        <w:t xml:space="preserve"> </w:t>
-      </w:r>
-      <w:proofErr w:type="spellStart"/>
-      <w:r>
-        <w:t>trạng</w:t>
-      </w:r>
-      <w:proofErr w:type="spellEnd"/>
-      <w:r>
-        <w:t xml:space="preserve">, </w:t>
-      </w:r>
-      <w:proofErr w:type="spellStart"/>
-      <w:r>
-        <w:t>xác</w:t>
-      </w:r>
-      <w:proofErr w:type="spellEnd"/>
-      <w:r>
-        <w:t xml:space="preserve"> </w:t>
-      </w:r>
-      <w:proofErr w:type="spellStart"/>
-      <w:r>
-        <w:t>định</w:t>
-      </w:r>
-      <w:proofErr w:type="spellEnd"/>
-      <w:r>
-        <w:t xml:space="preserve"> </w:t>
-      </w:r>
-      <w:proofErr w:type="spellStart"/>
-      <w:r>
-        <w:t>cấp</w:t>
-      </w:r>
-      <w:proofErr w:type="spellEnd"/>
-      <w:r>
-        <w:t xml:space="preserve"> </w:t>
-      </w:r>
-      <w:proofErr w:type="spellStart"/>
-      <w:r>
-        <w:t>độ</w:t>
-      </w:r>
-      <w:proofErr w:type="spellEnd"/>
-      <w:r>
-        <w:t xml:space="preserve"> an </w:t>
-      </w:r>
-      <w:proofErr w:type="spellStart"/>
-      <w:r>
-        <w:t>toàn</w:t>
-      </w:r>
-      <w:proofErr w:type="spellEnd"/>
-      <w:r>
-        <w:t xml:space="preserve"> </w:t>
-      </w:r>
-      <w:proofErr w:type="spellStart"/>
-      <w:r>
-        <w:t>thông</w:t>
-      </w:r>
-      <w:proofErr w:type="spellEnd"/>
-      <w:r>
-        <w:t xml:space="preserve"> tin </w:t>
-      </w:r>
-      <w:proofErr w:type="spellStart"/>
-      <w:r>
-        <w:t>của</w:t>
-      </w:r>
-      <w:proofErr w:type="spellEnd"/>
-      <w:r>
-        <w:t xml:space="preserve"> </w:t>
-      </w:r>
-      <w:proofErr w:type="spellStart"/>
-      <w:r>
-        <w:t>hệ</w:t>
-      </w:r>
-      <w:proofErr w:type="spellEnd"/>
-      <w:r>
-        <w:t xml:space="preserve"> </w:t>
-      </w:r>
-      <w:proofErr w:type="spellStart"/>
-      <w:r>
-        <w:t>thống</w:t>
-      </w:r>
-      <w:proofErr w:type="spellEnd"/>
-      <w:r>
-        <w:t xml:space="preserve"> </w:t>
-      </w:r>
-      <w:proofErr w:type="spellStart"/>
-      <w:r>
-        <w:t>thông</w:t>
-      </w:r>
-      <w:proofErr w:type="spellEnd"/>
-      <w:r>
-        <w:t xml:space="preserve"> tin </w:t>
-      </w:r>
-      <w:proofErr w:type="spellStart"/>
-      <w:r>
-        <w:t>theo</w:t>
-      </w:r>
-      <w:proofErr w:type="spellEnd"/>
-      <w:r>
-        <w:t xml:space="preserve"> </w:t>
-      </w:r>
-      <w:proofErr w:type="spellStart"/>
-      <w:r>
-        <w:t>quy</w:t>
-      </w:r>
-      <w:proofErr w:type="spellEnd"/>
-      <w:r>
-        <w:t xml:space="preserve"> </w:t>
-      </w:r>
-      <w:proofErr w:type="spellStart"/>
-      <w:r>
-        <w:t>định</w:t>
-      </w:r>
-      <w:proofErr w:type="spellEnd"/>
-      <w:r>
-        <w:t xml:space="preserve"> </w:t>
-      </w:r>
-      <w:proofErr w:type="spellStart"/>
-      <w:r>
-        <w:t>tại</w:t>
-      </w:r>
-      <w:proofErr w:type="spellEnd"/>
-      <w:r>
-        <w:t xml:space="preserve"> </w:t>
-      </w:r>
-      <w:proofErr w:type="spellStart"/>
-      <w:r>
-        <w:t>Nghị</w:t>
-      </w:r>
-      <w:proofErr w:type="spellEnd"/>
-      <w:r>
-        <w:t xml:space="preserve"> </w:t>
-      </w:r>
-      <w:proofErr w:type="spellStart"/>
-      <w:r>
-        <w:t>định</w:t>
-      </w:r>
-      <w:proofErr w:type="spellEnd"/>
-      <w:r>
-        <w:t xml:space="preserve"> </w:t>
-      </w:r>
-      <w:proofErr w:type="spellStart"/>
-      <w:r>
-        <w:t>số</w:t>
-      </w:r>
-      <w:proofErr w:type="spellEnd"/>
-      <w:r>
-        <w:t xml:space="preserve"> 85/2016/NĐ-CP </w:t>
-      </w:r>
-      <w:proofErr w:type="spellStart"/>
-      <w:r>
-        <w:t>và</w:t>
-      </w:r>
-      <w:proofErr w:type="spellEnd"/>
-      <w:r>
-        <w:t xml:space="preserve"> </w:t>
-      </w:r>
-      <w:proofErr w:type="spellStart"/>
-      <w:r>
-        <w:t>các</w:t>
-      </w:r>
-      <w:proofErr w:type="spellEnd"/>
-      <w:r>
-        <w:t xml:space="preserve"> </w:t>
-      </w:r>
-      <w:proofErr w:type="spellStart"/>
-      <w:r>
-        <w:t>văn</w:t>
-      </w:r>
-      <w:proofErr w:type="spellEnd"/>
-      <w:r>
-        <w:t xml:space="preserve"> </w:t>
-      </w:r>
-      <w:proofErr w:type="spellStart"/>
-      <w:r>
-        <w:t>bản</w:t>
-      </w:r>
-      <w:proofErr w:type="spellEnd"/>
-      <w:r>
-        <w:t xml:space="preserve"> </w:t>
-      </w:r>
-      <w:proofErr w:type="spellStart"/>
-      <w:r>
-        <w:t>hướng</w:t>
-      </w:r>
-      <w:proofErr w:type="spellEnd"/>
-      <w:r>
-        <w:t xml:space="preserve"> </w:t>
-      </w:r>
-      <w:proofErr w:type="spellStart"/>
-      <w:r>
-        <w:t>dẫn</w:t>
-      </w:r>
-      <w:proofErr w:type="spellEnd"/>
-      <w:r>
-        <w:t xml:space="preserve"> </w:t>
-      </w:r>
-      <w:proofErr w:type="spellStart"/>
-      <w:r>
-        <w:t>có</w:t>
-      </w:r>
-      <w:proofErr w:type="spellEnd"/>
-      <w:r>
-        <w:t xml:space="preserve"> </w:t>
-      </w:r>
-      <w:proofErr w:type="spellStart"/>
-      <w:r>
-        <w:t>liên</w:t>
-      </w:r>
-      <w:proofErr w:type="spellEnd"/>
-      <w:r>
-        <w:t xml:space="preserve"> </w:t>
-      </w:r>
-      <w:proofErr w:type="spellStart"/>
-      <w:r>
-        <w:t>quan</w:t>
-      </w:r>
-      <w:proofErr w:type="spellEnd"/>
-      <w:r>
-        <w:t xml:space="preserve">, </w:t>
-      </w:r>
-      <w:proofErr w:type="spellStart"/>
-      <w:r>
-        <w:t>phù</w:t>
-      </w:r>
-      <w:proofErr w:type="spellEnd"/>
-      <w:r>
-        <w:t xml:space="preserve"> </w:t>
-      </w:r>
-      <w:proofErr w:type="spellStart"/>
-      <w:r>
-        <w:t>hợp</w:t>
-      </w:r>
-      <w:proofErr w:type="spellEnd"/>
-      <w:r>
-        <w:t xml:space="preserve"> </w:t>
-      </w:r>
-      <w:proofErr w:type="spellStart"/>
-      <w:r>
-        <w:t>với</w:t>
-      </w:r>
-      <w:proofErr w:type="spellEnd"/>
-      <w:r>
-        <w:t xml:space="preserve"> </w:t>
-      </w:r>
-      <w:proofErr w:type="spellStart"/>
-      <w:r>
-        <w:t>quy</w:t>
-      </w:r>
-      <w:proofErr w:type="spellEnd"/>
-      <w:r>
-        <w:t xml:space="preserve"> </w:t>
-      </w:r>
-      <w:proofErr w:type="spellStart"/>
-      <w:r>
-        <w:t>mô</w:t>
-      </w:r>
-      <w:proofErr w:type="spellEnd"/>
-      <w:r>
-        <w:t xml:space="preserve">, </w:t>
-      </w:r>
-      <w:proofErr w:type="spellStart"/>
-      <w:r>
-        <w:t>chức</w:t>
-      </w:r>
-      <w:proofErr w:type="spellEnd"/>
-      <w:r>
-        <w:t xml:space="preserve"> </w:t>
-      </w:r>
-      <w:proofErr w:type="spellStart"/>
-      <w:r>
-        <w:t>năng</w:t>
-      </w:r>
-      <w:proofErr w:type="spellEnd"/>
-      <w:r>
-        <w:t xml:space="preserve">, </w:t>
-      </w:r>
-      <w:proofErr w:type="spellStart"/>
-      <w:r>
-        <w:t>nhiệm</w:t>
-      </w:r>
-      <w:proofErr w:type="spellEnd"/>
-      <w:r>
-        <w:t xml:space="preserve"> </w:t>
-      </w:r>
-      <w:proofErr w:type="spellStart"/>
-      <w:r>
-        <w:t>vụ</w:t>
-      </w:r>
-      <w:proofErr w:type="spellEnd"/>
-      <w:r>
-        <w:t xml:space="preserve"> </w:t>
-      </w:r>
-      <w:proofErr w:type="spellStart"/>
-      <w:r>
-        <w:t>và</w:t>
-      </w:r>
-      <w:proofErr w:type="spellEnd"/>
-      <w:r>
-        <w:t xml:space="preserve"> </w:t>
-      </w:r>
-      <w:proofErr w:type="spellStart"/>
-      <w:r>
-        <w:t>điều</w:t>
-      </w:r>
-      <w:proofErr w:type="spellEnd"/>
-      <w:r>
-        <w:t xml:space="preserve"> </w:t>
-      </w:r>
-      <w:proofErr w:type="spellStart"/>
-      <w:r>
-        <w:t>kiện</w:t>
-      </w:r>
-      <w:proofErr w:type="spellEnd"/>
-      <w:r>
-        <w:t xml:space="preserve"> </w:t>
-      </w:r>
-      <w:proofErr w:type="spellStart"/>
-      <w:r>
-        <w:t>thực</w:t>
-      </w:r>
-      <w:proofErr w:type="spellEnd"/>
-      <w:r>
-        <w:t xml:space="preserve"> </w:t>
-      </w:r>
-      <w:proofErr w:type="spellStart"/>
-      <w:r>
-        <w:t>tế</w:t>
-      </w:r>
-      <w:proofErr w:type="spellEnd"/>
-      <w:r>
-        <w:t xml:space="preserve"> </w:t>
-      </w:r>
-      <w:proofErr w:type="spellStart"/>
-      <w:r>
-        <w:t>của</w:t>
-      </w:r>
-      <w:proofErr w:type="spellEnd"/>
-      <w:r>
-        <w:t xml:space="preserve"> UBND </w:t>
-      </w:r>
-      <w:proofErr w:type="spellStart"/>
-      <w:r>
-        <w:t>xã</w:t>
-      </w:r>
-      <w:proofErr w:type="spellEnd"/>
-      <w:r>
-        <w:t xml:space="preserve"> </w:t>
-      </w:r>
-      <w:proofErr w:type="spellStart"/>
-      <w:r>
-        <w:t>Lý</w:t>
-      </w:r>
-      <w:proofErr w:type="spellEnd"/>
-      <w:r>
-        <w:t xml:space="preserve"> </w:t>
-      </w:r>
-      <w:proofErr w:type="spellStart"/>
-      <w:r>
-        <w:t>Nhân</w:t>
-      </w:r>
-      <w:proofErr w:type="spellEnd"/>
-      <w:r>
-        <w:t xml:space="preserve">, </w:t>
-      </w:r>
-      <w:proofErr w:type="spellStart"/>
-      <w:r>
-        <w:t>Tỉnh</w:t>
-      </w:r>
-      <w:proofErr w:type="spellEnd"/>
-      <w:r>
-        <w:t xml:space="preserve"> Ninh Bình</w:t>
-      </w:r>
-      <w:r>
-        <w:t>.</w:t>
-      </w:r>
+        <w:t>Phạm vi và đối tượng khảo sát nêu trên làm căn cứ để đánh giá hiện trạng, xác định cấp độ an toàn thông tin của hệ thống thông tin theo quy định tại Nghị định số 85/2016/NĐ-CP và các văn bản hướng dẫn có liên quan, phù hợp với quy mô, chức năng, nhiệm vụ và điều kiện thực tế của {{ten_don_vi}}, Tỉnh {{BC_ten_tinh}}.</w:t>
+      </w:r>
+      <w:proofErr w:type="spellStart"/>
+      <w:r/>
+      <w:proofErr w:type="spellEnd"/>
+      <w:r/>
+      <w:proofErr w:type="spellStart"/>
+      <w:r/>
+      <w:proofErr w:type="spellEnd"/>
+      <w:r/>
+      <w:proofErr w:type="spellStart"/>
+      <w:r/>
+      <w:proofErr w:type="spellEnd"/>
+      <w:r/>
+      <w:proofErr w:type="spellStart"/>
+      <w:r/>
+      <w:proofErr w:type="spellEnd"/>
+      <w:r/>
+      <w:proofErr w:type="spellStart"/>
+      <w:r/>
+      <w:proofErr w:type="spellEnd"/>
+      <w:r/>
+      <w:proofErr w:type="spellStart"/>
+      <w:r/>
+      <w:proofErr w:type="spellEnd"/>
+      <w:r/>
+      <w:proofErr w:type="spellStart"/>
+      <w:r/>
+      <w:proofErr w:type="spellEnd"/>
+      <w:r/>
+      <w:proofErr w:type="spellStart"/>
+      <w:r/>
+      <w:proofErr w:type="spellEnd"/>
+      <w:r/>
+      <w:proofErr w:type="spellStart"/>
+      <w:r/>
+      <w:proofErr w:type="spellEnd"/>
+      <w:r/>
+      <w:proofErr w:type="spellStart"/>
+      <w:r/>
+      <w:proofErr w:type="spellEnd"/>
+      <w:r/>
+      <w:proofErr w:type="spellStart"/>
+      <w:r/>
+      <w:proofErr w:type="spellEnd"/>
+      <w:r/>
+      <w:proofErr w:type="spellStart"/>
+      <w:r/>
+      <w:proofErr w:type="spellEnd"/>
+      <w:r/>
+      <w:proofErr w:type="spellStart"/>
+      <w:r/>
+      <w:proofErr w:type="spellEnd"/>
+      <w:r/>
+      <w:proofErr w:type="spellStart"/>
+      <w:r/>
+      <w:proofErr w:type="spellEnd"/>
+      <w:r/>
+      <w:proofErr w:type="spellStart"/>
+      <w:r/>
+      <w:proofErr w:type="spellEnd"/>
+      <w:r/>
+      <w:proofErr w:type="spellStart"/>
+      <w:r/>
+      <w:proofErr w:type="spellEnd"/>
+      <w:r/>
+      <w:proofErr w:type="spellStart"/>
+      <w:r/>
+      <w:proofErr w:type="spellEnd"/>
+      <w:r/>
+      <w:proofErr w:type="spellStart"/>
+      <w:r/>
+      <w:proofErr w:type="spellEnd"/>
+      <w:r/>
+      <w:proofErr w:type="spellStart"/>
+      <w:r/>
+      <w:proofErr w:type="spellEnd"/>
+      <w:r/>
+      <w:proofErr w:type="spellStart"/>
+      <w:r/>
+      <w:proofErr w:type="spellEnd"/>
+      <w:r/>
+      <w:proofErr w:type="spellStart"/>
+      <w:r/>
+      <w:proofErr w:type="spellEnd"/>
+      <w:r/>
+      <w:proofErr w:type="spellStart"/>
+      <w:r/>
+      <w:proofErr w:type="spellEnd"/>
+      <w:r/>
+      <w:proofErr w:type="spellStart"/>
+      <w:r/>
+      <w:proofErr w:type="spellEnd"/>
+      <w:r/>
+      <w:proofErr w:type="spellStart"/>
+      <w:r/>
+      <w:proofErr w:type="spellEnd"/>
+      <w:r/>
+      <w:proofErr w:type="spellStart"/>
+      <w:r/>
+      <w:proofErr w:type="spellEnd"/>
+      <w:r/>
+      <w:proofErr w:type="spellStart"/>
+      <w:r/>
+      <w:proofErr w:type="spellEnd"/>
+      <w:r/>
+      <w:proofErr w:type="spellStart"/>
+      <w:r/>
+      <w:proofErr w:type="spellEnd"/>
+      <w:r/>
+      <w:proofErr w:type="spellStart"/>
+      <w:r/>
+      <w:proofErr w:type="spellEnd"/>
+      <w:r/>
+      <w:proofErr w:type="spellStart"/>
+      <w:r/>
+      <w:proofErr w:type="spellEnd"/>
+      <w:r/>
+      <w:proofErr w:type="spellStart"/>
+      <w:r/>
+      <w:proofErr w:type="spellEnd"/>
+      <w:r/>
+      <w:proofErr w:type="spellStart"/>
+      <w:r/>
+      <w:proofErr w:type="spellEnd"/>
+      <w:r/>
+      <w:proofErr w:type="spellStart"/>
+      <w:r/>
+      <w:proofErr w:type="spellEnd"/>
+      <w:r/>
+      <w:proofErr w:type="spellStart"/>
+      <w:r/>
+      <w:proofErr w:type="spellEnd"/>
+      <w:r/>
+      <w:proofErr w:type="spellStart"/>
+      <w:r/>
+      <w:proofErr w:type="spellEnd"/>
+      <w:r/>
+      <w:proofErr w:type="spellStart"/>
+      <w:r/>
+      <w:proofErr w:type="spellEnd"/>
+      <w:r/>
+      <w:proofErr w:type="spellStart"/>
+      <w:r/>
+      <w:proofErr w:type="spellEnd"/>
+      <w:r/>
+      <w:proofErr w:type="spellStart"/>
+      <w:r/>
+      <w:proofErr w:type="spellEnd"/>
+      <w:r/>
+      <w:proofErr w:type="spellStart"/>
+      <w:r/>
+      <w:proofErr w:type="spellEnd"/>
+      <w:r/>
+      <w:proofErr w:type="spellStart"/>
+      <w:r/>
+      <w:proofErr w:type="spellEnd"/>
+      <w:r/>
+      <w:proofErr w:type="spellStart"/>
+      <w:r/>
+      <w:proofErr w:type="spellEnd"/>
+      <w:r/>
+      <w:proofErr w:type="spellStart"/>
+      <w:r/>
+      <w:proofErr w:type="spellEnd"/>
+      <w:r/>
+      <w:proofErr w:type="spellStart"/>
+      <w:r/>
+      <w:proofErr w:type="spellEnd"/>
+      <w:r/>
+      <w:proofErr w:type="spellStart"/>
+      <w:r/>
+      <w:proofErr w:type="spellEnd"/>
+      <w:r/>
+      <w:proofErr w:type="spellStart"/>
+      <w:r/>
+      <w:proofErr w:type="spellEnd"/>
+      <w:r/>
+      <w:proofErr w:type="spellStart"/>
+      <w:r/>
+      <w:proofErr w:type="spellEnd"/>
+      <w:r/>
+      <w:proofErr w:type="spellStart"/>
+      <w:r/>
+      <w:proofErr w:type="spellEnd"/>
+      <w:r/>
+      <w:proofErr w:type="spellStart"/>
+      <w:r/>
+      <w:proofErr w:type="spellEnd"/>
+      <w:r/>
+      <w:proofErr w:type="spellStart"/>
+      <w:r/>
+      <w:proofErr w:type="spellEnd"/>
+      <w:r/>
+      <w:proofErr w:type="spellStart"/>
+      <w:r/>
+      <w:proofErr w:type="spellEnd"/>
+      <w:r/>
+      <w:proofErr w:type="spellStart"/>
+      <w:r/>
+      <w:proofErr w:type="spellEnd"/>
+      <w:r/>
+      <w:proofErr w:type="spellStart"/>
+      <w:r/>
+      <w:proofErr w:type="spellEnd"/>
+      <w:r/>
+      <w:proofErr w:type="spellStart"/>
+      <w:r/>
+      <w:proofErr w:type="spellEnd"/>
+      <w:r/>
+      <w:proofErr w:type="spellStart"/>
+      <w:r/>
+      <w:proofErr w:type="spellEnd"/>
+      <w:r/>
+      <w:proofErr w:type="spellStart"/>
+      <w:r/>
+      <w:proofErr w:type="spellEnd"/>
+      <w:r/>
+      <w:proofErr w:type="spellStart"/>
+      <w:r/>
+      <w:proofErr w:type="spellEnd"/>
+      <w:r/>
+      <w:proofErr w:type="spellStart"/>
+      <w:r/>
+      <w:proofErr w:type="spellEnd"/>
+      <w:r/>
+      <w:proofErr w:type="spellStart"/>
+      <w:r/>
+      <w:proofErr w:type="spellEnd"/>
+      <w:r/>
+      <w:proofErr w:type="spellStart"/>
+      <w:r/>
+      <w:proofErr w:type="spellEnd"/>
+      <w:r/>
+      <w:proofErr w:type="spellStart"/>
+      <w:r/>
+      <w:proofErr w:type="spellEnd"/>
+      <w:r/>
+      <w:proofErr w:type="spellStart"/>
+      <w:r/>
+      <w:proofErr w:type="spellEnd"/>
+      <w:r/>
+      <w:r/>
     </w:p>
     <w:p>
       <w:pPr>
@@ -7162,7 +6196,7 @@
           <w:b/>
           <w:bCs/>
         </w:rPr>
-        <w:t xml:space="preserve">Danh </w:t>
+        <w:t>Danh sách trang thiết bị CNTT TẠI TRỤ SỞ {{ten_don_vi}}</w:t>
       </w:r>
       <w:proofErr w:type="spellStart"/>
       <w:r>
@@ -7170,7 +6204,6 @@
           <w:b/>
           <w:bCs/>
         </w:rPr>
-        <w:t>sách</w:t>
       </w:r>
       <w:proofErr w:type="spellEnd"/>
       <w:r>
@@ -7178,7 +6211,6 @@
           <w:b/>
           <w:bCs/>
         </w:rPr>
-        <w:t xml:space="preserve"> </w:t>
       </w:r>
       <w:proofErr w:type="spellStart"/>
       <w:r>
@@ -7186,7 +6218,6 @@
           <w:b/>
           <w:bCs/>
         </w:rPr>
-        <w:t>trang</w:t>
       </w:r>
       <w:proofErr w:type="spellEnd"/>
       <w:r>
@@ -7194,7 +6225,6 @@
           <w:b/>
           <w:bCs/>
         </w:rPr>
-        <w:t xml:space="preserve"> </w:t>
       </w:r>
       <w:proofErr w:type="spellStart"/>
       <w:r>
@@ -7202,7 +6232,6 @@
           <w:b/>
           <w:bCs/>
         </w:rPr>
-        <w:t>thiết</w:t>
       </w:r>
       <w:proofErr w:type="spellEnd"/>
       <w:r>
@@ -7210,7 +6239,6 @@
           <w:b/>
           <w:bCs/>
         </w:rPr>
-        <w:t xml:space="preserve"> </w:t>
       </w:r>
       <w:proofErr w:type="spellStart"/>
       <w:r>
@@ -7218,7 +6246,6 @@
           <w:b/>
           <w:bCs/>
         </w:rPr>
-        <w:t>bị</w:t>
       </w:r>
       <w:proofErr w:type="spellEnd"/>
       <w:r>
@@ -7226,14 +6253,12 @@
           <w:b/>
           <w:bCs/>
         </w:rPr>
-        <w:t xml:space="preserve"> CNTT TẠI TRỤ SỞ UBND XÃ </w:t>
       </w:r>
       <w:r>
         <w:rPr>
           <w:b/>
           <w:bCs/>
         </w:rPr>
-        <w:t>LÝ NHÂN</w:t>
       </w:r>
     </w:p>
     <w:tbl>
@@ -16631,61 +15656,55 @@
                 <w:sz w:val="24"/>
                 <w:szCs w:val="24"/>
               </w:rPr>
-              <w:t xml:space="preserve">UBND </w:t>
-            </w:r>
-            <w:proofErr w:type="spellStart"/>
-            <w:r>
-              <w:rPr>
-                <w:color w:val="000000" w:themeColor="text1"/>
-                <w:sz w:val="24"/>
-                <w:szCs w:val="24"/>
-              </w:rPr>
-              <w:t>xã</w:t>
-            </w:r>
-            <w:proofErr w:type="spellEnd"/>
-            <w:r>
-              <w:rPr>
-                <w:color w:val="000000" w:themeColor="text1"/>
-                <w:sz w:val="24"/>
-                <w:szCs w:val="24"/>
-              </w:rPr>
-              <w:t xml:space="preserve"> </w:t>
-            </w:r>
-            <w:proofErr w:type="spellStart"/>
-            <w:r>
-              <w:rPr>
-                <w:color w:val="000000" w:themeColor="text1"/>
-                <w:sz w:val="24"/>
-                <w:szCs w:val="24"/>
-              </w:rPr>
-              <w:t>Lý</w:t>
-            </w:r>
-            <w:proofErr w:type="spellEnd"/>
-            <w:r>
-              <w:rPr>
-                <w:color w:val="000000" w:themeColor="text1"/>
-                <w:sz w:val="24"/>
-                <w:szCs w:val="24"/>
-              </w:rPr>
-              <w:t xml:space="preserve"> </w:t>
-            </w:r>
-            <w:proofErr w:type="spellStart"/>
-            <w:r>
-              <w:rPr>
-                <w:color w:val="000000" w:themeColor="text1"/>
-                <w:sz w:val="24"/>
-                <w:szCs w:val="24"/>
-              </w:rPr>
-              <w:t>Nhân</w:t>
-            </w:r>
-            <w:proofErr w:type="spellEnd"/>
-            <w:r>
-              <w:rPr>
-                <w:color w:val="000000" w:themeColor="text1"/>
-                <w:sz w:val="24"/>
-                <w:szCs w:val="24"/>
-              </w:rPr>
-              <w:t xml:space="preserve"> </w:t>
+              <w:t xml:space="preserve">{{ten_don_vi}} </w:t>
+            </w:r>
+            <w:proofErr w:type="spellStart"/>
+            <w:r>
+              <w:rPr>
+                <w:color w:val="000000" w:themeColor="text1"/>
+                <w:sz w:val="24"/>
+                <w:szCs w:val="24"/>
+              </w:rPr>
+            </w:r>
+            <w:proofErr w:type="spellEnd"/>
+            <w:r>
+              <w:rPr>
+                <w:color w:val="000000" w:themeColor="text1"/>
+                <w:sz w:val="24"/>
+                <w:szCs w:val="24"/>
+              </w:rPr>
+            </w:r>
+            <w:proofErr w:type="spellStart"/>
+            <w:r>
+              <w:rPr>
+                <w:color w:val="000000" w:themeColor="text1"/>
+                <w:sz w:val="24"/>
+                <w:szCs w:val="24"/>
+              </w:rPr>
+            </w:r>
+            <w:proofErr w:type="spellEnd"/>
+            <w:r>
+              <w:rPr>
+                <w:color w:val="000000" w:themeColor="text1"/>
+                <w:sz w:val="24"/>
+                <w:szCs w:val="24"/>
+              </w:rPr>
+            </w:r>
+            <w:proofErr w:type="spellStart"/>
+            <w:r>
+              <w:rPr>
+                <w:color w:val="000000" w:themeColor="text1"/>
+                <w:sz w:val="24"/>
+                <w:szCs w:val="24"/>
+              </w:rPr>
+            </w:r>
+            <w:proofErr w:type="spellEnd"/>
+            <w:r>
+              <w:rPr>
+                <w:color w:val="000000" w:themeColor="text1"/>
+                <w:sz w:val="24"/>
+                <w:szCs w:val="24"/>
+              </w:rPr>
             </w:r>
           </w:p>
         </w:tc>
@@ -17041,52 +16060,47 @@
                 <w:sz w:val="24"/>
                 <w:szCs w:val="24"/>
               </w:rPr>
-              <w:t xml:space="preserve">UBND </w:t>
-            </w:r>
-            <w:proofErr w:type="spellStart"/>
-            <w:r>
-              <w:rPr>
-                <w:color w:val="000000" w:themeColor="text1"/>
-                <w:sz w:val="24"/>
-                <w:szCs w:val="24"/>
-              </w:rPr>
-              <w:t>xã</w:t>
-            </w:r>
-            <w:proofErr w:type="spellEnd"/>
-            <w:r>
-              <w:rPr>
-                <w:color w:val="000000" w:themeColor="text1"/>
-                <w:sz w:val="24"/>
-                <w:szCs w:val="24"/>
-              </w:rPr>
-              <w:t xml:space="preserve"> </w:t>
-            </w:r>
-            <w:proofErr w:type="spellStart"/>
-            <w:r>
-              <w:rPr>
-                <w:color w:val="000000" w:themeColor="text1"/>
-                <w:sz w:val="24"/>
-                <w:szCs w:val="24"/>
-              </w:rPr>
-              <w:t>Lý</w:t>
-            </w:r>
-            <w:proofErr w:type="spellEnd"/>
-            <w:r>
-              <w:rPr>
-                <w:color w:val="000000" w:themeColor="text1"/>
-                <w:sz w:val="24"/>
-                <w:szCs w:val="24"/>
-              </w:rPr>
-              <w:t xml:space="preserve"> </w:t>
-            </w:r>
-            <w:proofErr w:type="spellStart"/>
-            <w:r>
-              <w:rPr>
-                <w:color w:val="000000" w:themeColor="text1"/>
-                <w:sz w:val="24"/>
-                <w:szCs w:val="24"/>
-              </w:rPr>
-              <w:t>Nhân</w:t>
+              <w:t>{{ten_don_vi}}</w:t>
+            </w:r>
+            <w:proofErr w:type="spellStart"/>
+            <w:r>
+              <w:rPr>
+                <w:color w:val="000000" w:themeColor="text1"/>
+                <w:sz w:val="24"/>
+                <w:szCs w:val="24"/>
+              </w:rPr>
+            </w:r>
+            <w:proofErr w:type="spellEnd"/>
+            <w:r>
+              <w:rPr>
+                <w:color w:val="000000" w:themeColor="text1"/>
+                <w:sz w:val="24"/>
+                <w:szCs w:val="24"/>
+              </w:rPr>
+            </w:r>
+            <w:proofErr w:type="spellStart"/>
+            <w:r>
+              <w:rPr>
+                <w:color w:val="000000" w:themeColor="text1"/>
+                <w:sz w:val="24"/>
+                <w:szCs w:val="24"/>
+              </w:rPr>
+            </w:r>
+            <w:proofErr w:type="spellEnd"/>
+            <w:r>
+              <w:rPr>
+                <w:color w:val="000000" w:themeColor="text1"/>
+                <w:sz w:val="24"/>
+                <w:szCs w:val="24"/>
+              </w:rPr>
+            </w:r>
+            <w:proofErr w:type="spellStart"/>
+            <w:r>
+              <w:rPr>
+                <w:color w:val="000000" w:themeColor="text1"/>
+                <w:sz w:val="24"/>
+                <w:szCs w:val="24"/>
+              </w:rPr>
             </w:r>
             <w:proofErr w:type="spellEnd"/>
           </w:p>
@@ -17518,52 +16532,47 @@
                 <w:sz w:val="24"/>
                 <w:szCs w:val="24"/>
               </w:rPr>
-              <w:t xml:space="preserve">UBND </w:t>
-            </w:r>
-            <w:proofErr w:type="spellStart"/>
-            <w:r>
-              <w:rPr>
-                <w:color w:val="000000" w:themeColor="text1"/>
-                <w:sz w:val="24"/>
-                <w:szCs w:val="24"/>
-              </w:rPr>
-              <w:t>xã</w:t>
-            </w:r>
-            <w:proofErr w:type="spellEnd"/>
-            <w:r>
-              <w:rPr>
-                <w:color w:val="000000" w:themeColor="text1"/>
-                <w:sz w:val="24"/>
-                <w:szCs w:val="24"/>
-              </w:rPr>
-              <w:t xml:space="preserve"> </w:t>
-            </w:r>
-            <w:proofErr w:type="spellStart"/>
-            <w:r>
-              <w:rPr>
-                <w:color w:val="000000" w:themeColor="text1"/>
-                <w:sz w:val="24"/>
-                <w:szCs w:val="24"/>
-              </w:rPr>
-              <w:t>Lý</w:t>
-            </w:r>
-            <w:proofErr w:type="spellEnd"/>
-            <w:r>
-              <w:rPr>
-                <w:color w:val="000000" w:themeColor="text1"/>
-                <w:sz w:val="24"/>
-                <w:szCs w:val="24"/>
-              </w:rPr>
-              <w:t xml:space="preserve"> </w:t>
-            </w:r>
-            <w:proofErr w:type="spellStart"/>
-            <w:r>
-              <w:rPr>
-                <w:color w:val="000000" w:themeColor="text1"/>
-                <w:sz w:val="24"/>
-                <w:szCs w:val="24"/>
-              </w:rPr>
-              <w:t>Nhân</w:t>
+              <w:t>{{ten_don_vi}}</w:t>
+            </w:r>
+            <w:proofErr w:type="spellStart"/>
+            <w:r>
+              <w:rPr>
+                <w:color w:val="000000" w:themeColor="text1"/>
+                <w:sz w:val="24"/>
+                <w:szCs w:val="24"/>
+              </w:rPr>
+            </w:r>
+            <w:proofErr w:type="spellEnd"/>
+            <w:r>
+              <w:rPr>
+                <w:color w:val="000000" w:themeColor="text1"/>
+                <w:sz w:val="24"/>
+                <w:szCs w:val="24"/>
+              </w:rPr>
+            </w:r>
+            <w:proofErr w:type="spellStart"/>
+            <w:r>
+              <w:rPr>
+                <w:color w:val="000000" w:themeColor="text1"/>
+                <w:sz w:val="24"/>
+                <w:szCs w:val="24"/>
+              </w:rPr>
+            </w:r>
+            <w:proofErr w:type="spellEnd"/>
+            <w:r>
+              <w:rPr>
+                <w:color w:val="000000" w:themeColor="text1"/>
+                <w:sz w:val="24"/>
+                <w:szCs w:val="24"/>
+              </w:rPr>
+            </w:r>
+            <w:proofErr w:type="spellStart"/>
+            <w:r>
+              <w:rPr>
+                <w:color w:val="000000" w:themeColor="text1"/>
+                <w:sz w:val="24"/>
+                <w:szCs w:val="24"/>
+              </w:rPr>
             </w:r>
             <w:proofErr w:type="spellEnd"/>
           </w:p>
@@ -17950,52 +16959,47 @@
                 <w:sz w:val="24"/>
                 <w:szCs w:val="24"/>
               </w:rPr>
-              <w:t xml:space="preserve">UBND </w:t>
-            </w:r>
-            <w:proofErr w:type="spellStart"/>
-            <w:r>
-              <w:rPr>
-                <w:color w:val="000000" w:themeColor="text1"/>
-                <w:sz w:val="24"/>
-                <w:szCs w:val="24"/>
-              </w:rPr>
-              <w:t>xã</w:t>
-            </w:r>
-            <w:proofErr w:type="spellEnd"/>
-            <w:r>
-              <w:rPr>
-                <w:color w:val="000000" w:themeColor="text1"/>
-                <w:sz w:val="24"/>
-                <w:szCs w:val="24"/>
-              </w:rPr>
-              <w:t xml:space="preserve"> </w:t>
-            </w:r>
-            <w:proofErr w:type="spellStart"/>
-            <w:r>
-              <w:rPr>
-                <w:color w:val="000000" w:themeColor="text1"/>
-                <w:sz w:val="24"/>
-                <w:szCs w:val="24"/>
-              </w:rPr>
-              <w:t>Lý</w:t>
-            </w:r>
-            <w:proofErr w:type="spellEnd"/>
-            <w:r>
-              <w:rPr>
-                <w:color w:val="000000" w:themeColor="text1"/>
-                <w:sz w:val="24"/>
-                <w:szCs w:val="24"/>
-              </w:rPr>
-              <w:t xml:space="preserve"> </w:t>
-            </w:r>
-            <w:proofErr w:type="spellStart"/>
-            <w:r>
-              <w:rPr>
-                <w:color w:val="000000" w:themeColor="text1"/>
-                <w:sz w:val="24"/>
-                <w:szCs w:val="24"/>
-              </w:rPr>
-              <w:t>Nhân</w:t>
+              <w:t>{{ten_don_vi}}</w:t>
+            </w:r>
+            <w:proofErr w:type="spellStart"/>
+            <w:r>
+              <w:rPr>
+                <w:color w:val="000000" w:themeColor="text1"/>
+                <w:sz w:val="24"/>
+                <w:szCs w:val="24"/>
+              </w:rPr>
+            </w:r>
+            <w:proofErr w:type="spellEnd"/>
+            <w:r>
+              <w:rPr>
+                <w:color w:val="000000" w:themeColor="text1"/>
+                <w:sz w:val="24"/>
+                <w:szCs w:val="24"/>
+              </w:rPr>
+            </w:r>
+            <w:proofErr w:type="spellStart"/>
+            <w:r>
+              <w:rPr>
+                <w:color w:val="000000" w:themeColor="text1"/>
+                <w:sz w:val="24"/>
+                <w:szCs w:val="24"/>
+              </w:rPr>
+            </w:r>
+            <w:proofErr w:type="spellEnd"/>
+            <w:r>
+              <w:rPr>
+                <w:color w:val="000000" w:themeColor="text1"/>
+                <w:sz w:val="24"/>
+                <w:szCs w:val="24"/>
+              </w:rPr>
+            </w:r>
+            <w:proofErr w:type="spellStart"/>
+            <w:r>
+              <w:rPr>
+                <w:color w:val="000000" w:themeColor="text1"/>
+                <w:sz w:val="24"/>
+                <w:szCs w:val="24"/>
+              </w:rPr>
             </w:r>
             <w:proofErr w:type="spellEnd"/>
           </w:p>
@@ -18306,52 +17310,47 @@
                 <w:sz w:val="24"/>
                 <w:szCs w:val="24"/>
               </w:rPr>
-              <w:t xml:space="preserve">UBND </w:t>
-            </w:r>
-            <w:proofErr w:type="spellStart"/>
-            <w:r>
-              <w:rPr>
-                <w:color w:val="000000" w:themeColor="text1"/>
-                <w:sz w:val="24"/>
-                <w:szCs w:val="24"/>
-              </w:rPr>
-              <w:t>xã</w:t>
-            </w:r>
-            <w:proofErr w:type="spellEnd"/>
-            <w:r>
-              <w:rPr>
-                <w:color w:val="000000" w:themeColor="text1"/>
-                <w:sz w:val="24"/>
-                <w:szCs w:val="24"/>
-              </w:rPr>
-              <w:t xml:space="preserve"> </w:t>
-            </w:r>
-            <w:proofErr w:type="spellStart"/>
-            <w:r>
-              <w:rPr>
-                <w:color w:val="000000" w:themeColor="text1"/>
-                <w:sz w:val="24"/>
-                <w:szCs w:val="24"/>
-              </w:rPr>
-              <w:t>Lý</w:t>
-            </w:r>
-            <w:proofErr w:type="spellEnd"/>
-            <w:r>
-              <w:rPr>
-                <w:color w:val="000000" w:themeColor="text1"/>
-                <w:sz w:val="24"/>
-                <w:szCs w:val="24"/>
-              </w:rPr>
-              <w:t xml:space="preserve"> </w:t>
-            </w:r>
-            <w:proofErr w:type="spellStart"/>
-            <w:r>
-              <w:rPr>
-                <w:color w:val="000000" w:themeColor="text1"/>
-                <w:sz w:val="24"/>
-                <w:szCs w:val="24"/>
-              </w:rPr>
-              <w:t>Nhân</w:t>
+              <w:t>{{ten_don_vi}}</w:t>
+            </w:r>
+            <w:proofErr w:type="spellStart"/>
+            <w:r>
+              <w:rPr>
+                <w:color w:val="000000" w:themeColor="text1"/>
+                <w:sz w:val="24"/>
+                <w:szCs w:val="24"/>
+              </w:rPr>
+            </w:r>
+            <w:proofErr w:type="spellEnd"/>
+            <w:r>
+              <w:rPr>
+                <w:color w:val="000000" w:themeColor="text1"/>
+                <w:sz w:val="24"/>
+                <w:szCs w:val="24"/>
+              </w:rPr>
+            </w:r>
+            <w:proofErr w:type="spellStart"/>
+            <w:r>
+              <w:rPr>
+                <w:color w:val="000000" w:themeColor="text1"/>
+                <w:sz w:val="24"/>
+                <w:szCs w:val="24"/>
+              </w:rPr>
+            </w:r>
+            <w:proofErr w:type="spellEnd"/>
+            <w:r>
+              <w:rPr>
+                <w:color w:val="000000" w:themeColor="text1"/>
+                <w:sz w:val="24"/>
+                <w:szCs w:val="24"/>
+              </w:rPr>
+            </w:r>
+            <w:proofErr w:type="spellStart"/>
+            <w:r>
+              <w:rPr>
+                <w:color w:val="000000" w:themeColor="text1"/>
+                <w:sz w:val="24"/>
+                <w:szCs w:val="24"/>
+              </w:rPr>
             </w:r>
             <w:proofErr w:type="spellEnd"/>
           </w:p>
@@ -18590,52 +17589,47 @@
                 <w:sz w:val="24"/>
                 <w:szCs w:val="24"/>
               </w:rPr>
-              <w:t xml:space="preserve">UBND </w:t>
-            </w:r>
-            <w:proofErr w:type="spellStart"/>
-            <w:r>
-              <w:rPr>
-                <w:color w:val="000000" w:themeColor="text1"/>
-                <w:sz w:val="24"/>
-                <w:szCs w:val="24"/>
-              </w:rPr>
-              <w:t>xã</w:t>
-            </w:r>
-            <w:proofErr w:type="spellEnd"/>
-            <w:r>
-              <w:rPr>
-                <w:color w:val="000000" w:themeColor="text1"/>
-                <w:sz w:val="24"/>
-                <w:szCs w:val="24"/>
-              </w:rPr>
-              <w:t xml:space="preserve"> </w:t>
-            </w:r>
-            <w:proofErr w:type="spellStart"/>
-            <w:r>
-              <w:rPr>
-                <w:color w:val="000000" w:themeColor="text1"/>
-                <w:sz w:val="24"/>
-                <w:szCs w:val="24"/>
-              </w:rPr>
-              <w:t>Lý</w:t>
-            </w:r>
-            <w:proofErr w:type="spellEnd"/>
-            <w:r>
-              <w:rPr>
-                <w:color w:val="000000" w:themeColor="text1"/>
-                <w:sz w:val="24"/>
-                <w:szCs w:val="24"/>
-              </w:rPr>
-              <w:t xml:space="preserve"> </w:t>
-            </w:r>
-            <w:proofErr w:type="spellStart"/>
-            <w:r>
-              <w:rPr>
-                <w:color w:val="000000" w:themeColor="text1"/>
-                <w:sz w:val="24"/>
-                <w:szCs w:val="24"/>
-              </w:rPr>
-              <w:t>Nhân</w:t>
+              <w:t>{{ten_don_vi}}</w:t>
+            </w:r>
+            <w:proofErr w:type="spellStart"/>
+            <w:r>
+              <w:rPr>
+                <w:color w:val="000000" w:themeColor="text1"/>
+                <w:sz w:val="24"/>
+                <w:szCs w:val="24"/>
+              </w:rPr>
+            </w:r>
+            <w:proofErr w:type="spellEnd"/>
+            <w:r>
+              <w:rPr>
+                <w:color w:val="000000" w:themeColor="text1"/>
+                <w:sz w:val="24"/>
+                <w:szCs w:val="24"/>
+              </w:rPr>
+            </w:r>
+            <w:proofErr w:type="spellStart"/>
+            <w:r>
+              <w:rPr>
+                <w:color w:val="000000" w:themeColor="text1"/>
+                <w:sz w:val="24"/>
+                <w:szCs w:val="24"/>
+              </w:rPr>
+            </w:r>
+            <w:proofErr w:type="spellEnd"/>
+            <w:r>
+              <w:rPr>
+                <w:color w:val="000000" w:themeColor="text1"/>
+                <w:sz w:val="24"/>
+                <w:szCs w:val="24"/>
+              </w:rPr>
+            </w:r>
+            <w:proofErr w:type="spellStart"/>
+            <w:r>
+              <w:rPr>
+                <w:color w:val="000000" w:themeColor="text1"/>
+                <w:sz w:val="24"/>
+                <w:szCs w:val="24"/>
+              </w:rPr>
             </w:r>
             <w:proofErr w:type="spellEnd"/>
           </w:p>
@@ -18920,52 +17914,47 @@
                 <w:sz w:val="24"/>
                 <w:szCs w:val="24"/>
               </w:rPr>
-              <w:t xml:space="preserve">UBND </w:t>
-            </w:r>
-            <w:proofErr w:type="spellStart"/>
-            <w:r>
-              <w:rPr>
-                <w:color w:val="000000" w:themeColor="text1"/>
-                <w:sz w:val="24"/>
-                <w:szCs w:val="24"/>
-              </w:rPr>
-              <w:t>xã</w:t>
-            </w:r>
-            <w:proofErr w:type="spellEnd"/>
-            <w:r>
-              <w:rPr>
-                <w:color w:val="000000" w:themeColor="text1"/>
-                <w:sz w:val="24"/>
-                <w:szCs w:val="24"/>
-              </w:rPr>
-              <w:t xml:space="preserve"> </w:t>
-            </w:r>
-            <w:proofErr w:type="spellStart"/>
-            <w:r>
-              <w:rPr>
-                <w:color w:val="000000" w:themeColor="text1"/>
-                <w:sz w:val="24"/>
-                <w:szCs w:val="24"/>
-              </w:rPr>
-              <w:t>Lý</w:t>
-            </w:r>
-            <w:proofErr w:type="spellEnd"/>
-            <w:r>
-              <w:rPr>
-                <w:color w:val="000000" w:themeColor="text1"/>
-                <w:sz w:val="24"/>
-                <w:szCs w:val="24"/>
-              </w:rPr>
-              <w:t xml:space="preserve"> </w:t>
-            </w:r>
-            <w:proofErr w:type="spellStart"/>
-            <w:r>
-              <w:rPr>
-                <w:color w:val="000000" w:themeColor="text1"/>
-                <w:sz w:val="24"/>
-                <w:szCs w:val="24"/>
-              </w:rPr>
-              <w:t>Nhân</w:t>
+              <w:t>{{ten_don_vi}}</w:t>
+            </w:r>
+            <w:proofErr w:type="spellStart"/>
+            <w:r>
+              <w:rPr>
+                <w:color w:val="000000" w:themeColor="text1"/>
+                <w:sz w:val="24"/>
+                <w:szCs w:val="24"/>
+              </w:rPr>
+            </w:r>
+            <w:proofErr w:type="spellEnd"/>
+            <w:r>
+              <w:rPr>
+                <w:color w:val="000000" w:themeColor="text1"/>
+                <w:sz w:val="24"/>
+                <w:szCs w:val="24"/>
+              </w:rPr>
+            </w:r>
+            <w:proofErr w:type="spellStart"/>
+            <w:r>
+              <w:rPr>
+                <w:color w:val="000000" w:themeColor="text1"/>
+                <w:sz w:val="24"/>
+                <w:szCs w:val="24"/>
+              </w:rPr>
+            </w:r>
+            <w:proofErr w:type="spellEnd"/>
+            <w:r>
+              <w:rPr>
+                <w:color w:val="000000" w:themeColor="text1"/>
+                <w:sz w:val="24"/>
+                <w:szCs w:val="24"/>
+              </w:rPr>
+            </w:r>
+            <w:proofErr w:type="spellStart"/>
+            <w:r>
+              <w:rPr>
+                <w:color w:val="000000" w:themeColor="text1"/>
+                <w:sz w:val="24"/>
+                <w:szCs w:val="24"/>
+              </w:rPr>
             </w:r>
             <w:proofErr w:type="spellEnd"/>
           </w:p>
@@ -19322,52 +18311,47 @@
                 <w:sz w:val="24"/>
                 <w:szCs w:val="24"/>
               </w:rPr>
-              <w:t xml:space="preserve">UBND </w:t>
-            </w:r>
-            <w:proofErr w:type="spellStart"/>
-            <w:r>
-              <w:rPr>
-                <w:color w:val="000000" w:themeColor="text1"/>
-                <w:sz w:val="24"/>
-                <w:szCs w:val="24"/>
-              </w:rPr>
-              <w:t>xã</w:t>
-            </w:r>
-            <w:proofErr w:type="spellEnd"/>
-            <w:r>
-              <w:rPr>
-                <w:color w:val="000000" w:themeColor="text1"/>
-                <w:sz w:val="24"/>
-                <w:szCs w:val="24"/>
-              </w:rPr>
-              <w:t xml:space="preserve"> </w:t>
-            </w:r>
-            <w:proofErr w:type="spellStart"/>
-            <w:r>
-              <w:rPr>
-                <w:color w:val="000000" w:themeColor="text1"/>
-                <w:sz w:val="24"/>
-                <w:szCs w:val="24"/>
-              </w:rPr>
-              <w:t>Lý</w:t>
-            </w:r>
-            <w:proofErr w:type="spellEnd"/>
-            <w:r>
-              <w:rPr>
-                <w:color w:val="000000" w:themeColor="text1"/>
-                <w:sz w:val="24"/>
-                <w:szCs w:val="24"/>
-              </w:rPr>
-              <w:t xml:space="preserve"> </w:t>
-            </w:r>
-            <w:proofErr w:type="spellStart"/>
-            <w:r>
-              <w:rPr>
-                <w:color w:val="000000" w:themeColor="text1"/>
-                <w:sz w:val="24"/>
-                <w:szCs w:val="24"/>
-              </w:rPr>
-              <w:t>Nhân</w:t>
+              <w:t>{{ten_don_vi}}</w:t>
+            </w:r>
+            <w:proofErr w:type="spellStart"/>
+            <w:r>
+              <w:rPr>
+                <w:color w:val="000000" w:themeColor="text1"/>
+                <w:sz w:val="24"/>
+                <w:szCs w:val="24"/>
+              </w:rPr>
+            </w:r>
+            <w:proofErr w:type="spellEnd"/>
+            <w:r>
+              <w:rPr>
+                <w:color w:val="000000" w:themeColor="text1"/>
+                <w:sz w:val="24"/>
+                <w:szCs w:val="24"/>
+              </w:rPr>
+            </w:r>
+            <w:proofErr w:type="spellStart"/>
+            <w:r>
+              <w:rPr>
+                <w:color w:val="000000" w:themeColor="text1"/>
+                <w:sz w:val="24"/>
+                <w:szCs w:val="24"/>
+              </w:rPr>
+            </w:r>
+            <w:proofErr w:type="spellEnd"/>
+            <w:r>
+              <w:rPr>
+                <w:color w:val="000000" w:themeColor="text1"/>
+                <w:sz w:val="24"/>
+                <w:szCs w:val="24"/>
+              </w:rPr>
+            </w:r>
+            <w:proofErr w:type="spellStart"/>
+            <w:r>
+              <w:rPr>
+                <w:color w:val="000000" w:themeColor="text1"/>
+                <w:sz w:val="24"/>
+                <w:szCs w:val="24"/>
+              </w:rPr>
             </w:r>
             <w:proofErr w:type="spellEnd"/>
           </w:p>
@@ -23403,212 +22387,110 @@
       </w:pPr>
       <w:proofErr w:type="spellStart"/>
       <w:r>
-        <w:t>Trên</w:t>
-      </w:r>
-      <w:proofErr w:type="spellEnd"/>
-      <w:r>
-        <w:t xml:space="preserve"> </w:t>
-      </w:r>
-      <w:proofErr w:type="spellStart"/>
-      <w:r>
-        <w:t>đây</w:t>
-      </w:r>
-      <w:proofErr w:type="spellEnd"/>
-      <w:r>
-        <w:t xml:space="preserve"> </w:t>
-      </w:r>
-      <w:proofErr w:type="spellStart"/>
-      <w:r>
-        <w:t>là</w:t>
-      </w:r>
-      <w:proofErr w:type="spellEnd"/>
-      <w:r>
-        <w:t xml:space="preserve"> </w:t>
-      </w:r>
-      <w:proofErr w:type="spellStart"/>
-      <w:r>
-        <w:t>báo</w:t>
-      </w:r>
-      <w:proofErr w:type="spellEnd"/>
-      <w:r>
-        <w:t xml:space="preserve"> </w:t>
-      </w:r>
-      <w:proofErr w:type="spellStart"/>
-      <w:r>
-        <w:t>cáo</w:t>
-      </w:r>
-      <w:proofErr w:type="spellEnd"/>
-      <w:r>
-        <w:t xml:space="preserve"> </w:t>
-      </w:r>
-      <w:proofErr w:type="spellStart"/>
-      <w:r>
-        <w:t>khảo</w:t>
-      </w:r>
-      <w:proofErr w:type="spellEnd"/>
-      <w:r>
-        <w:t xml:space="preserve"> </w:t>
-      </w:r>
-      <w:proofErr w:type="spellStart"/>
-      <w:r>
-        <w:t>sát</w:t>
-      </w:r>
-      <w:proofErr w:type="spellEnd"/>
-      <w:r>
-        <w:t xml:space="preserve"> </w:t>
-      </w:r>
-      <w:proofErr w:type="spellStart"/>
-      <w:r>
-        <w:t>thực</w:t>
-      </w:r>
-      <w:proofErr w:type="spellEnd"/>
-      <w:r>
-        <w:t xml:space="preserve"> </w:t>
-      </w:r>
-      <w:proofErr w:type="spellStart"/>
-      <w:r>
-        <w:t>trạng</w:t>
-      </w:r>
-      <w:proofErr w:type="spellEnd"/>
-      <w:r>
-        <w:t xml:space="preserve"> </w:t>
-      </w:r>
-      <w:proofErr w:type="spellStart"/>
-      <w:r>
-        <w:t>hệ</w:t>
-      </w:r>
-      <w:proofErr w:type="spellEnd"/>
-      <w:r>
-        <w:t xml:space="preserve"> </w:t>
-      </w:r>
-      <w:proofErr w:type="spellStart"/>
-      <w:r>
-        <w:t>thống</w:t>
-      </w:r>
-      <w:proofErr w:type="spellEnd"/>
-      <w:r>
-        <w:t xml:space="preserve"> ATTT </w:t>
-      </w:r>
-      <w:proofErr w:type="spellStart"/>
-      <w:r>
-        <w:t>của</w:t>
-      </w:r>
-      <w:proofErr w:type="spellEnd"/>
-      <w:r>
-        <w:t xml:space="preserve"> Quý </w:t>
-      </w:r>
-      <w:proofErr w:type="spellStart"/>
-      <w:r>
-        <w:t>Ủy</w:t>
-      </w:r>
-      <w:proofErr w:type="spellEnd"/>
-      <w:r>
-        <w:t xml:space="preserve"> ban </w:t>
-      </w:r>
-      <w:proofErr w:type="spellStart"/>
-      <w:r>
-        <w:t>và</w:t>
-      </w:r>
-      <w:proofErr w:type="spellEnd"/>
-      <w:r>
-        <w:t xml:space="preserve"> </w:t>
-      </w:r>
-      <w:proofErr w:type="spellStart"/>
-      <w:r>
-        <w:t>tư</w:t>
-      </w:r>
-      <w:proofErr w:type="spellEnd"/>
-      <w:r>
-        <w:t xml:space="preserve"> </w:t>
-      </w:r>
-      <w:proofErr w:type="spellStart"/>
-      <w:r>
-        <w:t>vấn</w:t>
-      </w:r>
-      <w:proofErr w:type="spellEnd"/>
-      <w:r>
-        <w:t xml:space="preserve"> </w:t>
-      </w:r>
-      <w:proofErr w:type="spellStart"/>
-      <w:r>
-        <w:t>xây</w:t>
-      </w:r>
-      <w:proofErr w:type="spellEnd"/>
-      <w:r>
-        <w:t xml:space="preserve"> </w:t>
-      </w:r>
-      <w:proofErr w:type="spellStart"/>
-      <w:r>
-        <w:t>dựng</w:t>
-      </w:r>
-      <w:proofErr w:type="spellEnd"/>
-      <w:r>
-        <w:t xml:space="preserve"> </w:t>
-      </w:r>
-      <w:proofErr w:type="spellStart"/>
-      <w:r>
-        <w:t>hồ</w:t>
-      </w:r>
-      <w:proofErr w:type="spellEnd"/>
-      <w:r>
-        <w:t xml:space="preserve"> </w:t>
-      </w:r>
-      <w:proofErr w:type="spellStart"/>
-      <w:r>
-        <w:t>sơ</w:t>
-      </w:r>
-      <w:proofErr w:type="spellEnd"/>
-      <w:r>
-        <w:t xml:space="preserve"> </w:t>
-      </w:r>
-      <w:proofErr w:type="spellStart"/>
-      <w:r>
-        <w:t>cấp</w:t>
-      </w:r>
-      <w:proofErr w:type="spellEnd"/>
-      <w:r>
-        <w:t xml:space="preserve"> </w:t>
-      </w:r>
-      <w:proofErr w:type="spellStart"/>
-      <w:r>
-        <w:t>độ</w:t>
-      </w:r>
-      <w:proofErr w:type="spellEnd"/>
-      <w:r>
-        <w:t xml:space="preserve"> </w:t>
-      </w:r>
-      <w:proofErr w:type="spellStart"/>
-      <w:r>
-        <w:t>bảo</w:t>
-      </w:r>
-      <w:proofErr w:type="spellEnd"/>
-      <w:r>
-        <w:t xml:space="preserve"> </w:t>
-      </w:r>
-      <w:proofErr w:type="spellStart"/>
-      <w:r>
-        <w:t>đảm</w:t>
-      </w:r>
-      <w:proofErr w:type="spellEnd"/>
-      <w:r>
-        <w:t xml:space="preserve"> ATTT </w:t>
-      </w:r>
-      <w:proofErr w:type="spellStart"/>
-      <w:r>
-        <w:t>từ</w:t>
-      </w:r>
-      <w:proofErr w:type="spellEnd"/>
-      <w:r>
-        <w:t xml:space="preserve"> </w:t>
-      </w:r>
-      <w:proofErr w:type="spellStart"/>
-      <w:r>
-        <w:t>MobiFone</w:t>
-      </w:r>
-      <w:proofErr w:type="spellEnd"/>
-      <w:r>
-        <w:t>./.</w:t>
-      </w:r>
+        <w:t>Trên đây là báo cáo khảo sát thực trạng hệ thống ATTT của Quý Ủy ban và tư vấn xây dựng hồ sơ cấp độ bảo đảm ATTT từ {{BC_don_vi_thuc_hien}}./.</w:t>
+      </w:r>
+      <w:proofErr w:type="spellEnd"/>
+      <w:r/>
+      <w:proofErr w:type="spellStart"/>
+      <w:r/>
+      <w:proofErr w:type="spellEnd"/>
+      <w:r/>
+      <w:proofErr w:type="spellStart"/>
+      <w:r/>
+      <w:proofErr w:type="spellEnd"/>
+      <w:r/>
+      <w:proofErr w:type="spellStart"/>
+      <w:r/>
+      <w:proofErr w:type="spellEnd"/>
+      <w:r/>
+      <w:proofErr w:type="spellStart"/>
+      <w:r/>
+      <w:proofErr w:type="spellEnd"/>
+      <w:r/>
+      <w:proofErr w:type="spellStart"/>
+      <w:r/>
+      <w:proofErr w:type="spellEnd"/>
+      <w:r/>
+      <w:proofErr w:type="spellStart"/>
+      <w:r/>
+      <w:proofErr w:type="spellEnd"/>
+      <w:r/>
+      <w:proofErr w:type="spellStart"/>
+      <w:r/>
+      <w:proofErr w:type="spellEnd"/>
+      <w:r/>
+      <w:proofErr w:type="spellStart"/>
+      <w:r/>
+      <w:proofErr w:type="spellEnd"/>
+      <w:r/>
+      <w:proofErr w:type="spellStart"/>
+      <w:r/>
+      <w:proofErr w:type="spellEnd"/>
+      <w:r/>
+      <w:proofErr w:type="spellStart"/>
+      <w:r/>
+      <w:proofErr w:type="spellEnd"/>
+      <w:r/>
+      <w:proofErr w:type="spellStart"/>
+      <w:r/>
+      <w:proofErr w:type="spellEnd"/>
+      <w:r/>
+      <w:proofErr w:type="spellStart"/>
+      <w:r/>
+      <w:proofErr w:type="spellEnd"/>
+      <w:r/>
+      <w:proofErr w:type="spellStart"/>
+      <w:r/>
+      <w:proofErr w:type="spellEnd"/>
+      <w:r/>
+      <w:proofErr w:type="spellStart"/>
+      <w:r/>
+      <w:proofErr w:type="spellEnd"/>
+      <w:r/>
+      <w:proofErr w:type="spellStart"/>
+      <w:r/>
+      <w:proofErr w:type="spellEnd"/>
+      <w:r/>
+      <w:proofErr w:type="spellStart"/>
+      <w:r/>
+      <w:proofErr w:type="spellEnd"/>
+      <w:r/>
+      <w:proofErr w:type="spellStart"/>
+      <w:r/>
+      <w:proofErr w:type="spellEnd"/>
+      <w:r/>
+      <w:proofErr w:type="spellStart"/>
+      <w:r/>
+      <w:proofErr w:type="spellEnd"/>
+      <w:r/>
+      <w:proofErr w:type="spellStart"/>
+      <w:r/>
+      <w:proofErr w:type="spellEnd"/>
+      <w:r/>
+      <w:proofErr w:type="spellStart"/>
+      <w:r/>
+      <w:proofErr w:type="spellEnd"/>
+      <w:r/>
+      <w:proofErr w:type="spellStart"/>
+      <w:r/>
+      <w:proofErr w:type="spellEnd"/>
+      <w:r/>
+      <w:proofErr w:type="spellStart"/>
+      <w:r/>
+      <w:proofErr w:type="spellEnd"/>
+      <w:r/>
+      <w:proofErr w:type="spellStart"/>
+      <w:r/>
+      <w:proofErr w:type="spellEnd"/>
+      <w:r/>
+      <w:proofErr w:type="spellStart"/>
+      <w:r/>
+      <w:proofErr w:type="spellEnd"/>
+      <w:r/>
+      <w:proofErr w:type="spellStart"/>
+      <w:r/>
+      <w:proofErr w:type="spellEnd"/>
+      <w:r/>
     </w:p>
     <w:p>
       <w:pPr>

</xml_diff>